<commit_message>
docs: sync revised study results and resolve outdated notes
</commit_message>
<xml_diff>
--- a/docs/experiments/originals/study-results.docx
+++ b/docs/experiments/originals/study-results.docx
@@ -10,9 +10,15 @@
       </w:pPr>
       <w:r>
         <w:rPr>
+          <w:color w:val="000000"/>
           <w:rtl w:val="0"/>
         </w:rPr>
         <w:t xml:space="preserve">A2UI 사용자실험 논문용 결과표</w:t>
+      </w:r>
+      <w:r>
+        <w:rPr>
+          <w:rtl w:val="0"/>
+        </w:rPr>
       </w:r>
     </w:p>
     <w:p>
@@ -34,9 +40,15 @@
       </w:pPr>
       <w:r>
         <w:rPr>
+          <w:color w:val="000000"/>
           <w:rtl w:val="0"/>
         </w:rPr>
         <w:t xml:space="preserve">1. 참가자 구성 및 측정도구 검증</w:t>
+      </w:r>
+      <w:r>
+        <w:rPr>
+          <w:rtl w:val="0"/>
+        </w:rPr>
       </w:r>
     </w:p>
     <w:p>
@@ -47,9 +59,15 @@
       </w:pPr>
       <w:r>
         <w:rPr>
+          <w:color w:val="000000"/>
           <w:rtl w:val="0"/>
         </w:rPr>
         <w:t xml:space="preserve">1.1 UI 유형과 AI 리터러시 수준별 참가자 분포</w:t>
+      </w:r>
+      <w:r>
+        <w:rPr>
+          <w:rtl w:val="0"/>
+        </w:rPr>
       </w:r>
     </w:p>
     <w:p>
@@ -88,8 +106,8 @@
       <w:r>
         <w:rPr>
           <w:rFonts w:ascii="Noto Sans" w:cs="Noto Sans" w:eastAsia="Noto Sans" w:hAnsi="Noto Sans"/>
-          <w:b w:val="1"/>
-          <w:bCs w:val="1"/>
+          <w:b w:val="0"/>
+          <w:bCs w:val="0"/>
           <w:i w:val="0"/>
           <w:iCs w:val="0"/>
           <w:smallCaps w:val="0"/>
@@ -104,6 +122,11 @@
         </w:rPr>
         <w:t xml:space="preserve">계산 과정</w:t>
       </w:r>
+      <w:r>
+        <w:rPr>
+          <w:rtl w:val="0"/>
+        </w:rPr>
+      </w:r>
     </w:p>
     <w:p>
       <w:pPr>
@@ -112,17 +135,16 @@
       </w:pPr>
       <w:r>
         <w:rPr>
-          <w:b w:val="1"/>
-          <w:bCs w:val="1"/>
+          <w:b w:val="0"/>
+          <w:bCs w:val="0"/>
           <w:rtl w:val="0"/>
         </w:rPr>
-        <w:t xml:space="preserve">1) </w:t>
+        <w:t xml:space="preserve">1) 각 참가자의 사전 AI 리터러시 6문항 점수를 평균하여 개인별 AI 리터러시 점수를 산출하였다.</w:t>
       </w:r>
       <w:r>
         <w:rPr>
           <w:rtl w:val="0"/>
         </w:rPr>
-        <w:t xml:space="preserve">각 참가자의 사전 AI 리터러시 6문항 점수를 평균내어 개인별 AI 리터러시 평균을 계산.</w:t>
       </w:r>
     </w:p>
     <w:p>
@@ -935,7 +957,7 @@
           <w:vertAlign w:val="baseline"/>
           <w:rtl w:val="0"/>
         </w:rPr>
-        <w:t xml:space="preserve">주. AI 리터러시는 사전 6문항 평균 6.0을 기준으로 구분하였다. 출처: 02·04·05번.</w:t>
+        <w:t xml:space="preserve">주. AI 리터러시는 사전 6문항 평균 6.0을 기준으로 구분하였다. 분석자료: 02·04·05번.</w:t>
       </w:r>
     </w:p>
     <w:p>
@@ -974,8 +996,8 @@
       <w:r>
         <w:rPr>
           <w:rFonts w:ascii="Noto Sans" w:cs="Noto Sans" w:eastAsia="Noto Sans" w:hAnsi="Noto Sans"/>
-          <w:b w:val="1"/>
-          <w:bCs w:val="1"/>
+          <w:b w:val="0"/>
+          <w:bCs w:val="0"/>
           <w:i w:val="0"/>
           <w:iCs w:val="0"/>
           <w:smallCaps w:val="0"/>
@@ -989,6 +1011,11 @@
           <w:rtl w:val="0"/>
         </w:rPr>
         <w:t xml:space="preserve">표를 통해 알 수 있는 점</w:t>
+      </w:r>
+      <w:r>
+        <w:rPr>
+          <w:rtl w:val="0"/>
+        </w:rPr>
       </w:r>
     </w:p>
     <w:p>
@@ -1018,17 +1045,16 @@
       </w:pPr>
       <w:r>
         <w:rPr>
-          <w:b w:val="1"/>
-          <w:bCs w:val="1"/>
+          <w:b w:val="0"/>
+          <w:bCs w:val="0"/>
           <w:rtl w:val="0"/>
         </w:rPr>
-        <w:t xml:space="preserve">2) </w:t>
+        <w:t xml:space="preserve">2) 각 UI 조건에는 AI 리터러시가 낮은 참가자와 높은 참가자가 각각 10명씩 포함되어, 네 조건의 표본 수가 균형을 이루었다.</w:t>
       </w:r>
       <w:r>
         <w:rPr>
           <w:rtl w:val="0"/>
         </w:rPr>
-        <w:t xml:space="preserve">전체 AI 리터러시도 낮은 수준 20명, 높은 수준 20명으로 균형이 맞지만, UI 내부 구성은 A2UI가 낮음 10명·높음 10명, Baseline이 낮음 10명·높음 10명으로 서로 다르다.</w:t>
       </w:r>
     </w:p>
     <w:p>
@@ -1038,17 +1064,16 @@
       </w:pPr>
       <w:r>
         <w:rPr>
-          <w:b w:val="1"/>
-          <w:bCs w:val="1"/>
+          <w:b w:val="0"/>
+          <w:bCs w:val="0"/>
           <w:rtl w:val="0"/>
         </w:rPr>
-        <w:t xml:space="preserve">3) </w:t>
+        <w:t xml:space="preserve">3) 이후 표 5에서는 UI 유형과 AI 리터러시 수준의 주효과 및 두 요인의 상호작용을 함께 검토하였다.</w:t>
       </w:r>
       <w:r>
         <w:rPr>
           <w:rtl w:val="0"/>
         </w:rPr>
-        <w:t xml:space="preserve">따라서 단순히 A2UI와 Baseline의 평균만 비교하면 UI 효과와 AI 리터러시 구성 차이가 섞일 수 있다. 이후 표 5에서 UI와 AI 리터러시를 동시에 고려한 이유가 여기에 있다.</w:t>
       </w:r>
     </w:p>
     <w:p>
@@ -1059,9 +1084,15 @@
       </w:pPr>
       <w:r>
         <w:rPr>
+          <w:color w:val="000000"/>
           <w:rtl w:val="0"/>
         </w:rPr>
         <w:t xml:space="preserve">1.2 측정도구의 내적 일관성</w:t>
+      </w:r>
+      <w:r>
+        <w:rPr>
+          <w:rtl w:val="0"/>
+        </w:rPr>
       </w:r>
     </w:p>
     <w:p>
@@ -1100,8 +1131,8 @@
       <w:r>
         <w:rPr>
           <w:rFonts w:ascii="Noto Sans" w:cs="Noto Sans" w:eastAsia="Noto Sans" w:hAnsi="Noto Sans"/>
-          <w:b w:val="1"/>
-          <w:bCs w:val="1"/>
+          <w:b w:val="0"/>
+          <w:bCs w:val="0"/>
           <w:i w:val="0"/>
           <w:iCs w:val="0"/>
           <w:smallCaps w:val="0"/>
@@ -1115,6 +1146,11 @@
           <w:rtl w:val="0"/>
         </w:rPr>
         <w:t xml:space="preserve">계산 과정</w:t>
+      </w:r>
+      <w:r>
+        <w:rPr>
+          <w:rtl w:val="0"/>
+        </w:rPr>
       </w:r>
     </w:p>
     <w:p>
@@ -2717,7 +2753,7 @@
           <w:vertAlign w:val="baseline"/>
           <w:rtl w:val="0"/>
         </w:rPr>
-        <w:t xml:space="preserve">주. 재사용 의도는 단일 문항이므로 α를 산출하지 않았다. AI 리터러시는 사전 측정, 나머지는 사후 측정이다. 출처: 01번.</w:t>
+        <w:t xml:space="preserve">주. 재사용 의도는 단일 문항이므로 α를 산출하지 않았다. AI 리터러시는 사전 측정, 나머지는 사후 측정이다. 분석자료: 01번.</w:t>
       </w:r>
     </w:p>
     <w:p>
@@ -2756,8 +2792,8 @@
       <w:r>
         <w:rPr>
           <w:rFonts w:ascii="Noto Sans" w:cs="Noto Sans" w:eastAsia="Noto Sans" w:hAnsi="Noto Sans"/>
-          <w:b w:val="1"/>
-          <w:bCs w:val="1"/>
+          <w:b w:val="0"/>
+          <w:bCs w:val="0"/>
           <w:i w:val="0"/>
           <w:iCs w:val="0"/>
           <w:smallCaps w:val="0"/>
@@ -2771,6 +2807,11 @@
           <w:rtl w:val="0"/>
         </w:rPr>
         <w:t xml:space="preserve">표를 통해 알 수 있는 점</w:t>
+      </w:r>
+      <w:r>
+        <w:rPr>
+          <w:rtl w:val="0"/>
+        </w:rPr>
       </w:r>
     </w:p>
     <w:p>
@@ -2820,17 +2861,16 @@
       </w:pPr>
       <w:r>
         <w:rPr>
-          <w:b w:val="1"/>
-          <w:bCs w:val="1"/>
+          <w:b w:val="0"/>
+          <w:bCs w:val="0"/>
           <w:rtl w:val="0"/>
         </w:rPr>
-        <w:t xml:space="preserve">3) </w:t>
+        <w:t xml:space="preserve">3) 다문항 척도는 내적 일관성 측면의 근거를 제공하였다. 각 구성개념의 점수는 해당 문항의 평균으로 산출하였다. 다만 Cronbach’s α만으로 척도의 단일차원성이나 구성타당성이 확인되는 것은 아니다.</w:t>
       </w:r>
       <w:r>
         <w:rPr>
           <w:rtl w:val="0"/>
         </w:rPr>
-        <w:t xml:space="preserve">따라서 이후 분석에서 각 문항을 하나의 구성개념 점수로 묶어 평균을 사용하는 데 필요한 신뢰도 근거가 확보되어 있다.</w:t>
       </w:r>
     </w:p>
     <w:p>
@@ -2841,9 +2881,15 @@
       </w:pPr>
       <w:r>
         <w:rPr>
+          <w:color w:val="000000"/>
           <w:rtl w:val="0"/>
         </w:rPr>
         <w:t xml:space="preserve">2. 사후설문 기술통계</w:t>
+      </w:r>
+      <w:r>
+        <w:rPr>
+          <w:rtl w:val="0"/>
+        </w:rPr>
       </w:r>
     </w:p>
     <w:p>
@@ -2854,9 +2900,15 @@
       </w:pPr>
       <w:r>
         <w:rPr>
+          <w:color w:val="000000"/>
           <w:rtl w:val="0"/>
         </w:rPr>
         <w:t xml:space="preserve">2.1 UI 유형 및 AI 리터러시 수준별 사후설문 비교</w:t>
+      </w:r>
+      <w:r>
+        <w:rPr>
+          <w:rtl w:val="0"/>
+        </w:rPr>
       </w:r>
     </w:p>
     <w:p>
@@ -2895,8 +2947,8 @@
       <w:r>
         <w:rPr>
           <w:rFonts w:ascii="Noto Sans" w:cs="Noto Sans" w:eastAsia="Noto Sans" w:hAnsi="Noto Sans"/>
-          <w:b w:val="1"/>
-          <w:bCs w:val="1"/>
+          <w:b w:val="0"/>
+          <w:bCs w:val="0"/>
           <w:i w:val="0"/>
           <w:iCs w:val="0"/>
           <w:smallCaps w:val="0"/>
@@ -2910,6 +2962,11 @@
           <w:rtl w:val="0"/>
         </w:rPr>
         <w:t xml:space="preserve">계산 과정</w:t>
+      </w:r>
+      <w:r>
+        <w:rPr>
+          <w:rtl w:val="0"/>
+        </w:rPr>
       </w:r>
     </w:p>
     <w:p>
@@ -3082,7 +3139,7 @@
           <w:vertAlign w:val="baseline"/>
           <w:rtl w:val="0"/>
         </w:rPr>
-        <w:t xml:space="preserve">표 3·4. UI 유형 및 AI 리터러시 수준별 사후설문 기술통계</w:t>
+        <w:t xml:space="preserve">표 3. UI 유형 및 AI 리터러시 수준별 사후설문 기술통계</w:t>
       </w:r>
     </w:p>
     <w:tbl>
@@ -5184,7 +5241,7 @@
           <w:vertAlign w:val="baseline"/>
           <w:rtl w:val="0"/>
         </w:rPr>
-        <w:t xml:space="preserve">주. 값은 M (SD)이며 7점 척도이다. 전체 열은 N=40, UI 유형과 AI 리터러시 수준의 각 하위집단은 n=20이다. 인지부하는 점수가 높을수록 부담이 크다. UI 유형과 AI 리터러시 수준은 동일한 참가자 40명을 서로 다른 기준으로 나눈 결과이다. 출처: 02번.</w:t>
+        <w:t xml:space="preserve">주. 값은 M (SD)이며 7점 척도이다. 전체 열은 N=40, UI 유형과 AI 리터러시 수준의 각 하위집단은 n=20이다. 인지부하는 점수가 높을수록 부담이 크다. UI 유형과 AI 리터러시 수준은 동일한 참가자 40명을 서로 다른 기준으로 나눈 결과이다. 분석자료: 02번.</w:t>
       </w:r>
     </w:p>
     <w:p>
@@ -5223,8 +5280,8 @@
       <w:r>
         <w:rPr>
           <w:rFonts w:ascii="Noto Sans" w:cs="Noto Sans" w:eastAsia="Noto Sans" w:hAnsi="Noto Sans"/>
-          <w:b w:val="1"/>
-          <w:bCs w:val="1"/>
+          <w:b w:val="0"/>
+          <w:bCs w:val="0"/>
           <w:i w:val="0"/>
           <w:iCs w:val="0"/>
           <w:smallCaps w:val="0"/>
@@ -5238,6 +5295,11 @@
           <w:rtl w:val="0"/>
         </w:rPr>
         <w:t xml:space="preserve">표를 통해 알 수 있는 점</w:t>
+      </w:r>
+      <w:r>
+        <w:rPr>
+          <w:rtl w:val="0"/>
+        </w:rPr>
       </w:r>
     </w:p>
     <w:p>
@@ -5307,17 +5369,16 @@
       </w:pPr>
       <w:r>
         <w:rPr>
-          <w:b w:val="1"/>
-          <w:bCs w:val="1"/>
+          <w:b w:val="0"/>
+          <w:bCs w:val="0"/>
           <w:rtl w:val="0"/>
         </w:rPr>
-        <w:t xml:space="preserve">4) </w:t>
+        <w:t xml:space="preserve">4) 전체 평균에서는 긍정적 지표가 모두 7점 척도의 중립점인 4점보다 높고, 인지부하는 3.36점으로 중립점보다 낮다. 따라서 참가자들은 전반적으로 시스템을 긍정적으로 평가한 편이다.</w:t>
       </w:r>
       <w:r>
         <w:rPr>
           <w:rtl w:val="0"/>
         </w:rPr>
-        <w:t xml:space="preserve">전체 평균에서는 긍정적 지표가 모두 7점 척도의 중간값 4점보다 높고, 인지부하는 3.36점으로 중간값보다 낮다. 따라서 참가자들은 전반적으로 시스템을 긍정적으로 평가한 편이다.</w:t>
       </w:r>
     </w:p>
     <w:p>
@@ -5327,11 +5388,11 @@
       </w:pPr>
       <w:r>
         <w:rPr>
-          <w:b w:val="1"/>
-          <w:bCs w:val="1"/>
+          <w:b w:val="0"/>
+          <w:bCs w:val="0"/>
           <w:rtl w:val="0"/>
         </w:rPr>
-        <w:t xml:space="preserve">5) 다만 이 표는 평균과 표준편차를 보여주는 기술통계이다. A2UI와 Baseline의 차이 또는 AI 리터러시 수준의 차이가 통계적으로 유의한지는 표 6의 이원분산분석 결과를 함께 확인해야 한다.</w:t>
+        <w:t xml:space="preserve">5) 다만 이 표는 평균과 표준편차를 보여주는 기술통계이다. A2UI와 Baseline의 차이 또는 AI 리터러시 수준의 차이가 통계적으로 유의한지는 표 5의 이원분산분석 결과를 함께 확인해야 한다.</w:t>
       </w:r>
       <w:r>
         <w:rPr>
@@ -5361,12 +5422,12 @@
           <wp:inline distB="0" distT="0" distL="114300" distR="114300">
             <wp:extent cx="3270087" cy="1847704"/>
             <wp:effectExtent b="0" l="0" r="0" t="0"/>
-            <wp:docPr id="8" name="image2.png"/>
+            <wp:docPr id="10" name="image1.png"/>
             <a:graphic>
               <a:graphicData uri="http://schemas.openxmlformats.org/drawingml/2006/picture">
                 <pic:pic>
                   <pic:nvPicPr>
-                    <pic:cNvPr id="0" name="image2.png"/>
+                    <pic:cNvPr id="0" name="image1.png"/>
                     <pic:cNvPicPr preferRelativeResize="0"/>
                   </pic:nvPicPr>
                   <pic:blipFill>
@@ -5410,6 +5471,8 @@
           <w:rtl w:val="0"/>
         </w:rPr>
         <w:t xml:space="preserve">그림 1. UI 유형별 사후설문 7개 종속변수 평균</w:t>
+        <w:br w:type="textWrapping"/>
+        <w:t xml:space="preserve">주. 원문 그림을 유지하였다. 막대 높이와 오차막대의 정의는 표 3 및 그림 생성 자료와 대조해야 한다.</w:t>
       </w:r>
       <w:r>
         <w:rPr>
@@ -5464,9 +5527,15 @@
       </w:pPr>
       <w:r>
         <w:rPr>
+          <w:color w:val="000000"/>
           <w:rtl w:val="0"/>
         </w:rPr>
         <w:t xml:space="preserve">3. 사후설문 변수 간 상관관계</w:t>
+      </w:r>
+      <w:r>
+        <w:rPr>
+          <w:rtl w:val="0"/>
+        </w:rPr>
       </w:r>
     </w:p>
     <w:p>
@@ -5505,8 +5574,8 @@
       <w:r>
         <w:rPr>
           <w:rFonts w:ascii="Noto Sans" w:cs="Noto Sans" w:eastAsia="Noto Sans" w:hAnsi="Noto Sans"/>
-          <w:b w:val="1"/>
-          <w:bCs w:val="1"/>
+          <w:b w:val="0"/>
+          <w:bCs w:val="0"/>
           <w:i w:val="0"/>
           <w:iCs w:val="0"/>
           <w:smallCaps w:val="0"/>
@@ -5520,6 +5589,11 @@
           <w:rtl w:val="0"/>
         </w:rPr>
         <w:t xml:space="preserve">계산 과정</w:t>
+      </w:r>
+      <w:r>
+        <w:rPr>
+          <w:rtl w:val="0"/>
+        </w:rPr>
       </w:r>
     </w:p>
     <w:p>
@@ -5569,17 +5643,16 @@
       </w:pPr>
       <w:r>
         <w:rPr>
-          <w:b w:val="1"/>
-          <w:bCs w:val="1"/>
+          <w:b w:val="0"/>
+          <w:bCs w:val="0"/>
           <w:rtl w:val="0"/>
         </w:rPr>
-        <w:t xml:space="preserve">3) </w:t>
+        <w:t xml:space="preserve">3) 각 상관계수에 대해 양측검정 p값을 계산했으며, 표에는 ** p&lt;.05, * .05≤p&lt;.10로 표시하였다.</w:t>
       </w:r>
       <w:r>
         <w:rPr>
           <w:rtl w:val="0"/>
         </w:rPr>
-        <w:t xml:space="preserve">각 상관계수에 대해 양측검정 p값을 계산했으며, 표에는 ** p&lt;.05, * .05&lt;p&lt;.10로 표시하였다.</w:t>
       </w:r>
     </w:p>
     <w:p>
@@ -5652,7 +5725,7 @@
           <w:vertAlign w:val="baseline"/>
           <w:rtl w:val="0"/>
         </w:rPr>
-        <w:t xml:space="preserve">표 5. 사후설문 변수의 기술통계와 Pearson 상관계수</w:t>
+        <w:t xml:space="preserve">표 4. 사후설문 변수의 기술통계와 Pearson 상관계수</w:t>
       </w:r>
     </w:p>
     <w:tbl>
@@ -8558,7 +8631,7 @@
           <w:vertAlign w:val="baseline"/>
           <w:rtl w:val="0"/>
         </w:rPr>
-        <w:t xml:space="preserve">주. N=40. PU=지각된 유용성, PEU=사용 용이성, SAT=전반적 만족도, CL=인지부하, TQ=결과 신뢰도·품질, IQ=상호작용 품질, RI=재사용 의도. ** p&lt;.05, * .05&lt;p&lt;.10; 양측검정, 다중비교 보정 전. 출처: 03번.</w:t>
+        <w:t xml:space="preserve">주. N=40. PU=지각된 유용성, PEU=사용 용이성, SAT=전반적 만족도, CL=인지부하, TQ=결과 신뢰도·품질, IQ=상호작용 품질, RI=재사용 의도. ** p&lt;.05, * .05≤p&lt;.10; 양측검정, 다중비교 보정 전. 분석자료: 03번.</w:t>
       </w:r>
     </w:p>
     <w:p>
@@ -8597,8 +8670,8 @@
       <w:r>
         <w:rPr>
           <w:rFonts w:ascii="Noto Sans" w:cs="Noto Sans" w:eastAsia="Noto Sans" w:hAnsi="Noto Sans"/>
-          <w:b w:val="1"/>
-          <w:bCs w:val="1"/>
+          <w:b w:val="0"/>
+          <w:bCs w:val="0"/>
           <w:i w:val="0"/>
           <w:iCs w:val="0"/>
           <w:smallCaps w:val="0"/>
@@ -8613,25 +8686,10 @@
         </w:rPr>
         <w:t xml:space="preserve">표를 통해 알 수 있는 점</w:t>
       </w:r>
-    </w:p>
-    <w:p>
-      <w:pPr>
-        <w:ind w:left="113" w:firstLine="0"/>
-        <w:rPr/>
-      </w:pPr>
-      <w:r>
-        <w:rPr>
-          <w:b w:val="1"/>
-          <w:bCs w:val="1"/>
-          <w:rtl w:val="0"/>
-        </w:rPr>
-        <w:t xml:space="preserve">1) </w:t>
-      </w:r>
       <w:r>
         <w:rPr>
           <w:rtl w:val="0"/>
         </w:rPr>
-        <w:t xml:space="preserve">긍정적 사용자 경험 변수들은 서로 높은 정적 상관을 보였다. 특히 PU–SAT r=.80, TQ–IQ r=.86, SAT–RI r=.71로 매우 강하게 함께 움직였다.</w:t>
       </w:r>
     </w:p>
     <w:p>
@@ -8641,17 +8699,35 @@
       </w:pPr>
       <w:r>
         <w:rPr>
-          <w:b w:val="1"/>
-          <w:bCs w:val="1"/>
+          <w:b w:val="0"/>
+          <w:bCs w:val="0"/>
           <w:rtl w:val="0"/>
         </w:rPr>
-        <w:t xml:space="preserve">2) </w:t>
+        <w:t xml:space="preserve">1) 긍정적 사용자 경험 변수들은 서로 정적 상관을 보였다. 특히 PU–SAT(r=.80), TQ–IQ(r=.86), SAT–RI(r=.71)에서 높은 상관이 나타났다.</w:t>
       </w:r>
       <w:r>
         <w:rPr>
           <w:rtl w:val="0"/>
         </w:rPr>
-        <w:t xml:space="preserve">인지부하는 유용성, 사용 용이성, 만족도, 상호작용 품질, 재사용 의도와 유의한 음의 상관을 보였다. 다만 결과 신뢰도·품질과는 r≈−.25, p=.118로 유의하지 않았다.</w:t>
+      </w:r>
+    </w:p>
+    <w:p>
+      <w:pPr>
+        <w:ind w:left="113" w:firstLine="0"/>
+        <w:rPr/>
+      </w:pPr>
+      <w:r>
+        <w:rPr>
+          <w:b w:val="0"/>
+          <w:bCs w:val="0"/>
+          <w:rtl w:val="0"/>
+        </w:rPr>
+        <w:t xml:space="preserve">2) 인지부하는 지각된 유용성, 사용 용이성, 상호작용 품질 및 재사용 의도와 유의한 음의 상관을 보였다. 전반적 만족도(r=−.17) 및 결과 신뢰도·품질(r≈−.25, p=.118)과의 상관은 통계적으로 유의하지 않았다.</w:t>
+      </w:r>
+      <w:r>
+        <w:rPr>
+          <w:rtl w:val="0"/>
+        </w:rPr>
       </w:r>
     </w:p>
     <w:p>
@@ -8666,17 +8742,16 @@
       </w:pPr>
       <w:r>
         <w:rPr>
-          <w:b w:val="1"/>
-          <w:bCs w:val="1"/>
+          <w:b w:val="0"/>
+          <w:bCs w:val="0"/>
           <w:rtl w:val="0"/>
         </w:rPr>
-        <w:t xml:space="preserve">3) </w:t>
+        <w:t xml:space="preserve">3) 인지부하가 높을수록 일부 사용자 평가가 낮은 방향의 관련성이 관찰되었다. 다만 상관관계는 인과관계를 의미하지 않으며, 이 결과는 다중검정 보정 전의 탐색적 결과이다.</w:t>
       </w:r>
       <w:r>
         <w:rPr>
           <w:rtl w:val="0"/>
         </w:rPr>
-        <w:t xml:space="preserve">따라서 부담이 커질수록 전반적 사용자 평가가 낮아지는 방향은 보이지만, 상관관계는 인과관계를 뜻하지 않으며 신뢰도·품질과의 관계도 확정할 수 없다.</w:t>
       </w:r>
     </w:p>
     <w:p>
@@ -8687,9 +8762,15 @@
       </w:pPr>
       <w:r>
         <w:rPr>
+          <w:color w:val="000000"/>
           <w:rtl w:val="0"/>
         </w:rPr>
         <w:t xml:space="preserve">4. UI 유형 × AI 리터러시 이원분산분석</w:t>
+      </w:r>
+      <w:r>
+        <w:rPr>
+          <w:rtl w:val="0"/>
+        </w:rPr>
       </w:r>
     </w:p>
     <w:p>
@@ -8728,8 +8809,8 @@
       <w:r>
         <w:rPr>
           <w:rFonts w:ascii="Noto Sans" w:cs="Noto Sans" w:eastAsia="Noto Sans" w:hAnsi="Noto Sans"/>
-          <w:b w:val="1"/>
-          <w:bCs w:val="1"/>
+          <w:b w:val="0"/>
+          <w:bCs w:val="0"/>
           <w:i w:val="0"/>
           <w:iCs w:val="0"/>
           <w:smallCaps w:val="0"/>
@@ -8744,25 +8825,10 @@
         </w:rPr>
         <w:t xml:space="preserve">계산 과정</w:t>
       </w:r>
-    </w:p>
-    <w:p>
-      <w:pPr>
-        <w:ind w:left="113" w:firstLine="0"/>
-        <w:rPr/>
-      </w:pPr>
-      <w:r>
-        <w:rPr>
-          <w:b w:val="1"/>
-          <w:bCs w:val="1"/>
-          <w:rtl w:val="0"/>
-        </w:rPr>
-        <w:t xml:space="preserve">1) </w:t>
-      </w:r>
       <w:r>
         <w:rPr>
           <w:rtl w:val="0"/>
         </w:rPr>
-        <w:t xml:space="preserve">각 종속변수에 대해 UI 유형(A2UI/Baseline)과 AI 리터러시 수준(낮음/높음)을 동시에 투입한 2×2 이원분산분석을 실시하였다.</w:t>
       </w:r>
     </w:p>
     <w:p>
@@ -8776,13 +8842,32 @@
           <w:bCs w:val="1"/>
           <w:rtl w:val="0"/>
         </w:rPr>
-        <w:t xml:space="preserve">2) </w:t>
+        <w:t xml:space="preserve">1) 각 종속변수에 대해 UI 유형(A2UI/Baseline)과 AI 리터러시 수준(낮음/높음)을 동시에 투입한 2×2 이원분산분석을 실시하였다. TQ와 RI는 Box–Cox 변환 후 ANOVA 결과이며, 나머지 다섯 변수는 원자료 ANOVA 결과이다.</w:t>
       </w:r>
       <w:r>
         <w:rPr>
           <w:rtl w:val="0"/>
         </w:rPr>
-        <w:t xml:space="preserve">네 셀의 인원이 10·10·10·10명으로 완전히 같지 않기 때문에 저장된 분석에서는 효과 코딩 기반 Type III 제곱합을 사용하였다.</w:t>
+        <w:t xml:space="preserve"/>
+      </w:r>
+    </w:p>
+    <w:p>
+      <w:pPr>
+        <w:ind w:left="113" w:firstLine="0"/>
+        <w:rPr/>
+      </w:pPr>
+      <w:r>
+        <w:rPr>
+          <w:b w:val="0"/>
+          <w:bCs w:val="0"/>
+          <w:rtl w:val="0"/>
+        </w:rPr>
+        <w:t xml:space="preserve">2) 네 조건의 표본 수는 각각 10명으로 동일하였다. 분석에는 UI 유형, AI 리터러시 수준 및 두 요인의 상호작용을 포함하고, Type III 제곱합을 사용하였다.</w:t>
+      </w:r>
+      <w:r>
+        <w:rPr>
+          <w:rtl w:val="0"/>
+        </w:rPr>
       </w:r>
     </w:p>
     <w:p>
@@ -8872,18 +8957,16 @@
       </w:pPr>
       <w:r>
         <w:rPr>
-          <w:b w:val="1"/>
-          <w:bCs w:val="1"/>
+          <w:b w:val="0"/>
+          <w:bCs w:val="0"/>
           <w:rtl w:val="0"/>
         </w:rPr>
-        <w:t xml:space="preserve">계산 예시. </w:t>
+        <w:t xml:space="preserve">계산 예시. 표 5의 PU에 대한 AI 리터러시 주효과는 F(1, 36)=5.325이다. 이 F값을 F분포에 대입하면 p≈.02688로, 소수 셋째 자리에서 p=.027로 표시된다. F값은 효과 평균제곱을 오차 평균제곱으로 나눈 값이다.</w:t>
       </w:r>
       <w:r>
         <w:rPr>
           <w:rtl w:val="0"/>
         </w:rPr>
-        <w:t xml:space="preserve">PU에 대한 AI 리터러시 효과는 SS효과=8.251, df=1 → MS효과=8.251이고, 오차 SS=56.432, df=36 → MS오차=1.568이다. 따라서 F=8.251/1.568=5.264, p=.028로 계산된다.</w:t>
-        <w:br w:type="textWrapping"/>
       </w:r>
     </w:p>
     <w:p>
@@ -8936,7 +9019,7 @@
           <w:vertAlign w:val="baseline"/>
           <w:rtl w:val="0"/>
         </w:rPr>
-        <w:t xml:space="preserve">표 6. UI 유형과 AI 리터러시 수준에 따른 사후설문 이원분산분석(Type III)</w:t>
+        <w:t xml:space="preserve">표 5. UI 유형과 AI 리터러시 수준에 따른 사후설문 이원분산분석(Type III)</w:t>
       </w:r>
     </w:p>
     <w:tbl>
@@ -10169,7 +10252,7 @@
             </w:pPr>
             <w:sdt>
               <w:sdtPr>
-                <w:id w:val="672435289"/>
+                <w:id w:val="372434535"/>
                 <w:tag w:val="goog_rdk_0"/>
               </w:sdtPr>
               <w:sdtContent>
@@ -10500,166 +10583,13 @@
             <w:r>
               <w:rPr>
                 <w:rFonts w:ascii="Times New Roman" w:cs="Times New Roman" w:eastAsia="Times New Roman" w:hAnsi="Times New Roman"/>
-                <w:b w:val="0"/>
-                <w:bCs w:val="0"/>
                 <w:color w:val="e06666"/>
                 <w:sz w:val="15"/>
                 <w:szCs w:val="15"/>
                 <w:rtl w:val="0"/>
               </w:rPr>
-              <w:t xml:space="preserve">.050**</w:t>
-            </w:r>
-            <w:r>
-              <w:rPr>
-                <w:rtl w:val="0"/>
-              </w:rPr>
-            </w:r>
-          </w:p>
-        </w:tc>
-        <w:tc>
-          <w:tcPr>
-            <w:tcBorders>
-              <w:top w:color="000000" w:space="0" w:sz="0" w:val="nil"/>
-              <w:left w:color="000000" w:space="0" w:sz="0" w:val="nil"/>
-              <w:bottom w:color="000000" w:space="0" w:sz="0" w:val="nil"/>
-              <w:right w:color="000000" w:space="0" w:sz="0" w:val="nil"/>
-            </w:tcBorders>
-            <w:tcMar>
-              <w:top w:w="30.0" w:type="dxa"/>
-              <w:left w:w="35.0" w:type="dxa"/>
-              <w:bottom w:w="30.0" w:type="dxa"/>
-              <w:right w:w="35.0" w:type="dxa"/>
-            </w:tcMar>
-            <w:vAlign w:val="center"/>
-          </w:tcPr>
-          <w:p>
-            <w:pPr>
-              <w:spacing w:after="0" w:before="0" w:lineRule="auto"/>
-              <w:jc w:val="center"/>
-              <w:rPr/>
-            </w:pPr>
-            <w:r>
-              <w:rPr>
-                <w:rFonts w:ascii="Times New Roman" w:cs="Times New Roman" w:eastAsia="Times New Roman" w:hAnsi="Times New Roman"/>
-                <w:b w:val="0"/>
-                <w:bCs w:val="0"/>
-                <w:sz w:val="15"/>
-                <w:szCs w:val="15"/>
-                <w:rtl w:val="0"/>
-              </w:rPr>
-              <w:t xml:space="preserve">2.141</w:t>
-            </w:r>
-            <w:r>
-              <w:rPr>
-                <w:rtl w:val="0"/>
-              </w:rPr>
-            </w:r>
-          </w:p>
-        </w:tc>
-        <w:tc>
-          <w:tcPr>
-            <w:tcBorders>
-              <w:top w:color="000000" w:space="0" w:sz="0" w:val="nil"/>
-              <w:left w:color="000000" w:space="0" w:sz="0" w:val="nil"/>
-              <w:bottom w:color="000000" w:space="0" w:sz="0" w:val="nil"/>
-              <w:right w:color="000000" w:space="0" w:sz="0" w:val="nil"/>
-            </w:tcBorders>
-            <w:tcMar>
-              <w:top w:w="30.0" w:type="dxa"/>
-              <w:left w:w="35.0" w:type="dxa"/>
-              <w:bottom w:w="30.0" w:type="dxa"/>
-              <w:right w:w="35.0" w:type="dxa"/>
-            </w:tcMar>
-            <w:vAlign w:val="center"/>
-          </w:tcPr>
-          <w:p>
-            <w:pPr>
-              <w:spacing w:after="0" w:before="0" w:lineRule="auto"/>
-              <w:jc w:val="center"/>
-              <w:rPr/>
-            </w:pPr>
-            <w:r>
-              <w:rPr>
-                <w:rFonts w:ascii="Times New Roman" w:cs="Times New Roman" w:eastAsia="Times New Roman" w:hAnsi="Times New Roman"/>
-                <w:b w:val="0"/>
-                <w:bCs w:val="0"/>
-                <w:sz w:val="15"/>
-                <w:szCs w:val="15"/>
-                <w:rtl w:val="0"/>
-              </w:rPr>
-              <w:t xml:space="preserve">.152</w:t>
-            </w:r>
-            <w:r>
-              <w:rPr>
-                <w:rtl w:val="0"/>
-              </w:rPr>
-            </w:r>
-          </w:p>
-        </w:tc>
-        <w:tc>
-          <w:tcPr>
-            <w:tcBorders>
-              <w:top w:color="000000" w:space="0" w:sz="0" w:val="nil"/>
-              <w:left w:color="000000" w:space="0" w:sz="0" w:val="nil"/>
-              <w:bottom w:color="000000" w:space="0" w:sz="0" w:val="nil"/>
-              <w:right w:color="000000" w:space="0" w:sz="0" w:val="nil"/>
-            </w:tcBorders>
-            <w:tcMar>
-              <w:top w:w="30.0" w:type="dxa"/>
-              <w:left w:w="35.0" w:type="dxa"/>
-              <w:bottom w:w="30.0" w:type="dxa"/>
-              <w:right w:w="35.0" w:type="dxa"/>
-            </w:tcMar>
-            <w:vAlign w:val="center"/>
-          </w:tcPr>
-          <w:p>
-            <w:pPr>
-              <w:spacing w:after="0" w:before="0" w:lineRule="auto"/>
-              <w:jc w:val="center"/>
-              <w:rPr/>
-            </w:pPr>
-            <w:r>
-              <w:rPr>
-                <w:rFonts w:ascii="Times New Roman" w:cs="Times New Roman" w:eastAsia="Times New Roman" w:hAnsi="Times New Roman"/>
-                <w:b w:val="0"/>
-                <w:bCs w:val="0"/>
-                <w:sz w:val="15"/>
-                <w:szCs w:val="15"/>
-                <w:rtl w:val="0"/>
-              </w:rPr>
-              <w:t xml:space="preserve">6.771</w:t>
-            </w:r>
-            <w:r>
-              <w:rPr>
-                <w:rtl w:val="0"/>
-              </w:rPr>
-            </w:r>
-          </w:p>
-        </w:tc>
-        <w:tc>
-          <w:tcPr>
-            <w:tcBorders>
-              <w:top w:color="000000" w:space="0" w:sz="0" w:val="nil"/>
-              <w:left w:color="000000" w:space="0" w:sz="0" w:val="nil"/>
-              <w:bottom w:color="000000" w:space="0" w:sz="0" w:val="nil"/>
-              <w:right w:color="000000" w:space="0" w:sz="0" w:val="nil"/>
-            </w:tcBorders>
-            <w:tcMar>
-              <w:top w:w="30.0" w:type="dxa"/>
-              <w:left w:w="35.0" w:type="dxa"/>
-              <w:bottom w:w="30.0" w:type="dxa"/>
-              <w:right w:w="35.0" w:type="dxa"/>
-            </w:tcMar>
-            <w:vAlign w:val="center"/>
-          </w:tcPr>
-          <w:p>
-            <w:pPr>
-              <w:spacing w:after="0" w:before="0" w:lineRule="auto"/>
-              <w:jc w:val="center"/>
-              <w:rPr>
-                <w:color w:val="e06666"/>
-              </w:rPr>
-            </w:pPr>
+              <w:t xml:space="preserve">0.049</w:t>
+            </w:r>
             <w:r>
               <w:rPr>
                 <w:rFonts w:ascii="Times New Roman" w:cs="Times New Roman" w:eastAsia="Times New Roman" w:hAnsi="Times New Roman"/>
@@ -10670,6 +10600,169 @@
                 <w:szCs w:val="15"/>
                 <w:rtl w:val="0"/>
               </w:rPr>
+              <w:t xml:space="preserve">**</w:t>
+            </w:r>
+            <w:r>
+              <w:rPr>
+                <w:rtl w:val="0"/>
+              </w:rPr>
+            </w:r>
+          </w:p>
+        </w:tc>
+        <w:tc>
+          <w:tcPr>
+            <w:tcBorders>
+              <w:top w:color="000000" w:space="0" w:sz="0" w:val="nil"/>
+              <w:left w:color="000000" w:space="0" w:sz="0" w:val="nil"/>
+              <w:bottom w:color="000000" w:space="0" w:sz="0" w:val="nil"/>
+              <w:right w:color="000000" w:space="0" w:sz="0" w:val="nil"/>
+            </w:tcBorders>
+            <w:tcMar>
+              <w:top w:w="30.0" w:type="dxa"/>
+              <w:left w:w="35.0" w:type="dxa"/>
+              <w:bottom w:w="30.0" w:type="dxa"/>
+              <w:right w:w="35.0" w:type="dxa"/>
+            </w:tcMar>
+            <w:vAlign w:val="center"/>
+          </w:tcPr>
+          <w:p>
+            <w:pPr>
+              <w:spacing w:after="0" w:before="0" w:lineRule="auto"/>
+              <w:jc w:val="center"/>
+              <w:rPr/>
+            </w:pPr>
+            <w:r>
+              <w:rPr>
+                <w:rFonts w:ascii="Times New Roman" w:cs="Times New Roman" w:eastAsia="Times New Roman" w:hAnsi="Times New Roman"/>
+                <w:b w:val="0"/>
+                <w:bCs w:val="0"/>
+                <w:sz w:val="15"/>
+                <w:szCs w:val="15"/>
+                <w:rtl w:val="0"/>
+              </w:rPr>
+              <w:t xml:space="preserve">2.141</w:t>
+            </w:r>
+            <w:r>
+              <w:rPr>
+                <w:rtl w:val="0"/>
+              </w:rPr>
+            </w:r>
+          </w:p>
+        </w:tc>
+        <w:tc>
+          <w:tcPr>
+            <w:tcBorders>
+              <w:top w:color="000000" w:space="0" w:sz="0" w:val="nil"/>
+              <w:left w:color="000000" w:space="0" w:sz="0" w:val="nil"/>
+              <w:bottom w:color="000000" w:space="0" w:sz="0" w:val="nil"/>
+              <w:right w:color="000000" w:space="0" w:sz="0" w:val="nil"/>
+            </w:tcBorders>
+            <w:tcMar>
+              <w:top w:w="30.0" w:type="dxa"/>
+              <w:left w:w="35.0" w:type="dxa"/>
+              <w:bottom w:w="30.0" w:type="dxa"/>
+              <w:right w:w="35.0" w:type="dxa"/>
+            </w:tcMar>
+            <w:vAlign w:val="center"/>
+          </w:tcPr>
+          <w:p>
+            <w:pPr>
+              <w:spacing w:after="0" w:before="0" w:lineRule="auto"/>
+              <w:jc w:val="center"/>
+              <w:rPr/>
+            </w:pPr>
+            <w:r>
+              <w:rPr>
+                <w:rFonts w:ascii="Times New Roman" w:cs="Times New Roman" w:eastAsia="Times New Roman" w:hAnsi="Times New Roman"/>
+                <w:b w:val="0"/>
+                <w:bCs w:val="0"/>
+                <w:sz w:val="15"/>
+                <w:szCs w:val="15"/>
+                <w:rtl w:val="0"/>
+              </w:rPr>
+              <w:t xml:space="preserve">.152</w:t>
+            </w:r>
+            <w:r>
+              <w:rPr>
+                <w:rtl w:val="0"/>
+              </w:rPr>
+            </w:r>
+          </w:p>
+        </w:tc>
+        <w:tc>
+          <w:tcPr>
+            <w:tcBorders>
+              <w:top w:color="000000" w:space="0" w:sz="0" w:val="nil"/>
+              <w:left w:color="000000" w:space="0" w:sz="0" w:val="nil"/>
+              <w:bottom w:color="000000" w:space="0" w:sz="0" w:val="nil"/>
+              <w:right w:color="000000" w:space="0" w:sz="0" w:val="nil"/>
+            </w:tcBorders>
+            <w:tcMar>
+              <w:top w:w="30.0" w:type="dxa"/>
+              <w:left w:w="35.0" w:type="dxa"/>
+              <w:bottom w:w="30.0" w:type="dxa"/>
+              <w:right w:w="35.0" w:type="dxa"/>
+            </w:tcMar>
+            <w:vAlign w:val="center"/>
+          </w:tcPr>
+          <w:p>
+            <w:pPr>
+              <w:spacing w:after="0" w:before="0" w:lineRule="auto"/>
+              <w:jc w:val="center"/>
+              <w:rPr/>
+            </w:pPr>
+            <w:r>
+              <w:rPr>
+                <w:rFonts w:ascii="Times New Roman" w:cs="Times New Roman" w:eastAsia="Times New Roman" w:hAnsi="Times New Roman"/>
+                <w:b w:val="0"/>
+                <w:bCs w:val="0"/>
+                <w:sz w:val="15"/>
+                <w:szCs w:val="15"/>
+                <w:rtl w:val="0"/>
+              </w:rPr>
+              <w:t xml:space="preserve">6.771</w:t>
+            </w:r>
+            <w:r>
+              <w:rPr>
+                <w:rtl w:val="0"/>
+              </w:rPr>
+            </w:r>
+          </w:p>
+        </w:tc>
+        <w:tc>
+          <w:tcPr>
+            <w:tcBorders>
+              <w:top w:color="000000" w:space="0" w:sz="0" w:val="nil"/>
+              <w:left w:color="000000" w:space="0" w:sz="0" w:val="nil"/>
+              <w:bottom w:color="000000" w:space="0" w:sz="0" w:val="nil"/>
+              <w:right w:color="000000" w:space="0" w:sz="0" w:val="nil"/>
+            </w:tcBorders>
+            <w:tcMar>
+              <w:top w:w="30.0" w:type="dxa"/>
+              <w:left w:w="35.0" w:type="dxa"/>
+              <w:bottom w:w="30.0" w:type="dxa"/>
+              <w:right w:w="35.0" w:type="dxa"/>
+            </w:tcMar>
+            <w:vAlign w:val="center"/>
+          </w:tcPr>
+          <w:p>
+            <w:pPr>
+              <w:spacing w:after="0" w:before="0" w:lineRule="auto"/>
+              <w:jc w:val="center"/>
+              <w:rPr>
+                <w:color w:val="e06666"/>
+              </w:rPr>
+            </w:pPr>
+            <w:r>
+              <w:rPr>
+                <w:rFonts w:ascii="Times New Roman" w:cs="Times New Roman" w:eastAsia="Times New Roman" w:hAnsi="Times New Roman"/>
+                <w:b w:val="0"/>
+                <w:bCs w:val="0"/>
+                <w:color w:val="e06666"/>
+                <w:sz w:val="15"/>
+                <w:szCs w:val="15"/>
+                <w:rtl w:val="0"/>
+              </w:rPr>
               <w:t xml:space="preserve">.013**</w:t>
             </w:r>
             <w:r>
@@ -10875,7 +10968,7 @@
             </w:pPr>
             <w:sdt>
               <w:sdtPr>
-                <w:id w:val="1683983787"/>
+                <w:id w:val="2007929213"/>
                 <w:tag w:val="goog_rdk_1"/>
               </w:sdtPr>
               <w:sdtContent>
@@ -11587,7 +11680,7 @@
             </w:pPr>
             <w:sdt>
               <w:sdtPr>
-                <w:id w:val="-226767355"/>
+                <w:id w:val="-68124599"/>
                 <w:tag w:val="goog_rdk_2"/>
               </w:sdtPr>
               <w:sdtContent>
@@ -12294,7 +12387,7 @@
       </w:pPr>
       <w:sdt>
         <w:sdtPr>
-          <w:id w:val="1207338889"/>
+          <w:id w:val="-902873169"/>
           <w:tag w:val="goog_rdk_3"/>
         </w:sdtPr>
         <w:sdtContent>
@@ -12307,7 +12400,7 @@
               <w:iCs w:val="0"/>
               <w:smallCaps w:val="0"/>
               <w:strike w:val="0"/>
-              <w:color w:val="000000"/>
+              <w:color w:val="c62828"/>
               <w:sz w:val="17"/>
               <w:szCs w:val="17"/>
               <w:u w:val="none"/>
@@ -12315,96 +12408,15 @@
               <w:vertAlign w:val="baseline"/>
               <w:rtl w:val="0"/>
             </w:rPr>
-            <w:t xml:space="preserve">주. N=40. NumDF=효과 자유도, DenDF=오차 자유도. 모든 효과는 F(1, 36)으로 검정하였다. PU=지각된 유용성, PEU=사용 용이성, SAT=전반적 만족도, CL=인지부하, TQ=결과 신뢰도·품질, IQ=상호작용 품질, RI=재사용 의도.</w:t>
-            <w:br w:type="textWrapping"/>
-            <w:t xml:space="preserve"> </w:t>
+            <w:t xml:space="preserve">주. N=40. NumDF=효과 자유도, DenDF=오차 자유도. 모든 효과는 F(1, 36)으로 검정하였다. PU=지각된 유용성, PEU=사용 용이성, SAT=전반적 만족도, CL=인지부하, TQ=결과 신뢰도·품질, IQ=상호작용 품질, RI=재사용 의도. ** p&lt;.05, * .05≤p&lt;.10. p값은 다중검정 보정 전 값이다. TQ와 RI는 Box–Cox 변환 후 ANOVA 결과이며, 나머지 다섯 변수는 원자료 ANOVA 결과이다.</w:t>
           </w:r>
         </w:sdtContent>
       </w:sdt>
       <w:r>
         <w:rPr>
-          <w:rFonts w:ascii="Times New Roman" w:cs="Times New Roman" w:eastAsia="Times New Roman" w:hAnsi="Times New Roman"/>
-          <w:b w:val="0"/>
-          <w:bCs w:val="0"/>
-          <w:i w:val="0"/>
-          <w:iCs w:val="0"/>
-          <w:smallCaps w:val="0"/>
-          <w:strike w:val="0"/>
-          <w:color w:val="c62828"/>
-          <w:sz w:val="17"/>
-          <w:szCs w:val="17"/>
-          <w:u w:val="none"/>
-          <w:shd w:fill="auto" w:val="clear"/>
-          <w:vertAlign w:val="baseline"/>
           <w:rtl w:val="0"/>
         </w:rPr>
-        <w:t xml:space="preserve">**</w:t>
       </w:r>
-      <w:r>
-        <w:rPr>
-          <w:rFonts w:ascii="Times New Roman" w:cs="Times New Roman" w:eastAsia="Times New Roman" w:hAnsi="Times New Roman"/>
-          <w:b w:val="0"/>
-          <w:bCs w:val="0"/>
-          <w:i w:val="0"/>
-          <w:iCs w:val="0"/>
-          <w:smallCaps w:val="0"/>
-          <w:strike w:val="0"/>
-          <w:color w:val="000000"/>
-          <w:sz w:val="17"/>
-          <w:szCs w:val="17"/>
-          <w:u w:val="none"/>
-          <w:shd w:fill="auto" w:val="clear"/>
-          <w:vertAlign w:val="baseline"/>
-          <w:rtl w:val="0"/>
-        </w:rPr>
-        <w:t xml:space="preserve"> p &lt; .05, </w:t>
-      </w:r>
-      <w:r>
-        <w:rPr>
-          <w:rFonts w:ascii="Times New Roman" w:cs="Times New Roman" w:eastAsia="Times New Roman" w:hAnsi="Times New Roman"/>
-          <w:b w:val="0"/>
-          <w:bCs w:val="0"/>
-          <w:i w:val="0"/>
-          <w:iCs w:val="0"/>
-          <w:smallCaps w:val="0"/>
-          <w:strike w:val="0"/>
-          <w:color w:val="1565c0"/>
-          <w:sz w:val="17"/>
-          <w:szCs w:val="17"/>
-          <w:u w:val="none"/>
-          <w:shd w:fill="auto" w:val="clear"/>
-          <w:vertAlign w:val="baseline"/>
-          <w:rtl w:val="0"/>
-        </w:rPr>
-        <w:t xml:space="preserve">*</w:t>
-      </w:r>
-      <w:sdt>
-        <w:sdtPr>
-          <w:id w:val="-184078419"/>
-          <w:tag w:val="goog_rdk_4"/>
-        </w:sdtPr>
-        <w:sdtContent>
-          <w:r>
-            <w:rPr>
-              <w:rFonts w:ascii="Gungsuh" w:cs="Gungsuh" w:eastAsia="Gungsuh" w:hAnsi="Gungsuh"/>
-              <w:b w:val="0"/>
-              <w:bCs w:val="0"/>
-              <w:i w:val="0"/>
-              <w:iCs w:val="0"/>
-              <w:smallCaps w:val="0"/>
-              <w:strike w:val="0"/>
-              <w:color w:val="000000"/>
-              <w:sz w:val="17"/>
-              <w:szCs w:val="17"/>
-              <w:u w:val="none"/>
-              <w:shd w:fill="auto" w:val="clear"/>
-              <w:vertAlign w:val="baseline"/>
-              <w:rtl w:val="0"/>
-            </w:rPr>
-            <w:t xml:space="preserve"> .05 &lt; p &lt; .10. p값은 다중검정 보정 전 값이다.</w:t>
-          </w:r>
-        </w:sdtContent>
-      </w:sdt>
     </w:p>
     <w:p>
       <w:pPr>
@@ -12471,8 +12483,8 @@
       <w:r>
         <w:rPr>
           <w:rFonts w:ascii="Noto Sans" w:cs="Noto Sans" w:eastAsia="Noto Sans" w:hAnsi="Noto Sans"/>
-          <w:b w:val="1"/>
-          <w:bCs w:val="1"/>
+          <w:b w:val="0"/>
+          <w:bCs w:val="0"/>
           <w:i w:val="0"/>
           <w:iCs w:val="0"/>
           <w:smallCaps w:val="0"/>
@@ -12487,25 +12499,10 @@
         </w:rPr>
         <w:t xml:space="preserve">표를 통해 알 수 있는 점</w:t>
       </w:r>
-    </w:p>
-    <w:p>
-      <w:pPr>
-        <w:ind w:left="113" w:firstLine="0"/>
-        <w:rPr/>
-      </w:pPr>
-      <w:r>
-        <w:rPr>
-          <w:b w:val="1"/>
-          <w:bCs w:val="1"/>
-          <w:rtl w:val="0"/>
-        </w:rPr>
-        <w:t xml:space="preserve">1) </w:t>
-      </w:r>
       <w:r>
         <w:rPr>
           <w:rtl w:val="0"/>
         </w:rPr>
-        <w:t xml:space="preserve">UI 유형의 주효과는 7개 변수 모두 p&gt;.05였다. 따라서 현재 표본에서 A2UI가 Baseline보다 통계적으로 우수하다고 확정할 근거는 얻지 못했다.</w:t>
       </w:r>
     </w:p>
     <w:p>
@@ -12515,17 +12512,16 @@
       </w:pPr>
       <w:r>
         <w:rPr>
-          <w:b w:val="1"/>
-          <w:bCs w:val="1"/>
+          <w:b w:val="0"/>
+          <w:bCs w:val="0"/>
           <w:rtl w:val="0"/>
         </w:rPr>
-        <w:t xml:space="preserve">2) </w:t>
+        <w:t xml:space="preserve">1) UI 유형의 주효과는 전반적 만족도(SAT)와 결과 신뢰도·품질(TQ)에서 유의하였다. SAT는 F(1, 36)=4.122, TQ는 F(1, 36)=6.771이었다. 두 변수의 전체 평균은 A2UI가 Baseline보다 높았다. 나머지 다섯 변수의 UI 주효과는 .05 기준에서 유의하지 않았다.</w:t>
       </w:r>
       <w:r>
         <w:rPr>
           <w:rtl w:val="0"/>
         </w:rPr>
-        <w:t xml:space="preserve">AI 리터러시는 PU(F=5.325, p=.027), TQ(F=6.589, p=.015), IQ(F=5.546, p=.024), RI(F=5.602, p=.023)에서 유의했다. 즉 사용자 특성이 일부 주관적 평가에 실제로 관련되어 있었다.</w:t>
       </w:r>
     </w:p>
     <w:p>
@@ -12535,17 +12531,16 @@
       </w:pPr>
       <w:r>
         <w:rPr>
-          <w:b w:val="1"/>
-          <w:bCs w:val="1"/>
+          <w:b w:val="0"/>
+          <w:bCs w:val="0"/>
           <w:rtl w:val="0"/>
         </w:rPr>
-        <w:t xml:space="preserve">3) </w:t>
+        <w:t xml:space="preserve">2) AI 리터러시 수준의 주효과는 지각된 유용성(F=5.325, p=.027), 전반적 만족도(F=4.497, p=.041), 결과 신뢰도·품질(F=6.589, p=.015), 상호작용 품질(F=5.546, p=.024), 재사용 의도(F=5.602, p=.023)에서 유의하였다. 해당 변수의 전체 평균은 높은 수준 집단에서 더 높았다.</w:t>
       </w:r>
       <w:r>
         <w:rPr>
           <w:rtl w:val="0"/>
         </w:rPr>
-        <w:t xml:space="preserve">UI×AI 리터러시 상호작용은 모든 변수에서 유의하지 않았다. 따라서 A2UI 효과가 낮은/높은 AI 리터러시 집단에서 명확히 다르게 나타났다고 볼 수 없다.</w:t>
       </w:r>
     </w:p>
     <w:p>
@@ -12555,17 +12550,35 @@
       </w:pPr>
       <w:r>
         <w:rPr>
-          <w:b w:val="1"/>
-          <w:bCs w:val="1"/>
+          <w:b w:val="0"/>
+          <w:bCs w:val="0"/>
           <w:rtl w:val="0"/>
         </w:rPr>
-        <w:t xml:space="preserve">4) </w:t>
+        <w:t xml:space="preserve">3) UI 유형×AI 리터러시 수준 상호작용은 인지부하에서 유의하였다(F=4.574, p=.039). 따라서 인지부하는 네 조건의 평균과 단순효과를 함께 검토해야 한다. 현재의 주변평균만으로 어느 AI 리터러시 집단에서 UI 차이가 나타났는지 판단할 수 없다. 나머지 6개 변수의 상호작용은 유의하지 않았다.</w:t>
       </w:r>
       <w:r>
         <w:rPr>
           <w:rtl w:val="0"/>
         </w:rPr>
-        <w:t xml:space="preserve">전반적 만족도의 UI 주효과 p=.057처럼 .05에 가까운 값도 .05보다 크므로 “유의”라고 쓰지 않는다. “A2UI에 유리한 경향은 있었으나 통계적 유의성에는 도달하지 않았다”라고 표현하는 것이 적절하다.</w:t>
+      </w:r>
+    </w:p>
+    <w:p>
+      <w:pPr>
+        <w:ind w:left="113" w:firstLine="0"/>
+        <w:rPr/>
+      </w:pPr>
+      <w:r>
+        <w:rPr>
+          <w:b w:val="0"/>
+          <w:bCs w:val="0"/>
+          <w:rtl w:val="0"/>
+        </w:rPr>
+        <w:t xml:space="preserve">4) 위 유의성 판단은 다중검정 보정 전 결과이다. 효과크기 및 신뢰구간을 함께 검토해야 하며, 비유의한 결과가 두 조건의 동등성을 입증하는 것은 아니다.</w:t>
+      </w:r>
+      <w:r>
+        <w:rPr>
+          <w:rtl w:val="0"/>
+        </w:rPr>
       </w:r>
     </w:p>
     <w:p>
@@ -12580,17 +12593,16 @@
       </w:pPr>
       <w:r>
         <w:rPr>
-          <w:b w:val="1"/>
-          <w:bCs w:val="1"/>
+          <w:b w:val="0"/>
+          <w:bCs w:val="0"/>
           <w:rtl w:val="0"/>
         </w:rPr>
-        <w:t xml:space="preserve">5) </w:t>
+        <w:t xml:space="preserve">5) 이 문서에는 잔차 정규성 및 등분산성 검정 결과가 제시되어 있지 않다. 최종 보고 전 분석 출력에서 가정 검증 결과와 모형 설정을 확인하고, 필요한 경우 근거에 따라 강건성 분석을 별도로 보고해야 한다.</w:t>
       </w:r>
       <w:r>
         <w:rPr>
           <w:rtl w:val="0"/>
         </w:rPr>
-        <w:t xml:space="preserve">04번 저장 결과에는 잔차 정규성·등분산성 검정이 포함되어 있지 않으므로, 최종 제출 전에는 ANOVA 가정 검증을 추가 확인해야 한다.</w:t>
       </w:r>
     </w:p>
     <w:p>
@@ -12601,9 +12613,15 @@
       </w:pPr>
       <w:r>
         <w:rPr>
+          <w:color w:val="000000"/>
           <w:rtl w:val="0"/>
         </w:rPr>
         <w:t xml:space="preserve">5. 행동 로그 분석</w:t>
+      </w:r>
+      <w:r>
+        <w:rPr>
+          <w:rtl w:val="0"/>
+        </w:rPr>
       </w:r>
     </w:p>
     <w:p>
@@ -12614,9 +12632,15 @@
       </w:pPr>
       <w:r>
         <w:rPr>
+          <w:color w:val="000000"/>
           <w:rtl w:val="0"/>
         </w:rPr>
         <w:t xml:space="preserve">5.1 참가자별 두 과제 합산 수행시간과 프롬프트 수</w:t>
+      </w:r>
+      <w:r>
+        <w:rPr>
+          <w:rtl w:val="0"/>
+        </w:rPr>
       </w:r>
     </w:p>
     <w:p>
@@ -12655,8 +12679,8 @@
       <w:r>
         <w:rPr>
           <w:rFonts w:ascii="Noto Sans" w:cs="Noto Sans" w:eastAsia="Noto Sans" w:hAnsi="Noto Sans"/>
-          <w:b w:val="1"/>
-          <w:bCs w:val="1"/>
+          <w:b w:val="0"/>
+          <w:bCs w:val="0"/>
           <w:i w:val="0"/>
           <w:iCs w:val="0"/>
           <w:smallCaps w:val="0"/>
@@ -12671,25 +12695,10 @@
         </w:rPr>
         <w:t xml:space="preserve">계산 과정</w:t>
       </w:r>
-    </w:p>
-    <w:p>
-      <w:pPr>
-        <w:ind w:left="113" w:firstLine="0"/>
-        <w:rPr/>
-      </w:pPr>
-      <w:r>
-        <w:rPr>
-          <w:b w:val="1"/>
-          <w:bCs w:val="1"/>
-          <w:rtl w:val="0"/>
-        </w:rPr>
-        <w:t xml:space="preserve">1) </w:t>
-      </w:r>
       <w:r>
         <w:rPr>
           <w:rtl w:val="0"/>
         </w:rPr>
-        <w:t xml:space="preserve">참가자마다 Task 1과 Task 2의 수행시간을 각각 계산한 뒤 두 과제 시간을 합산하였다. 각 과제 시간은 스레드의 첫 요청부터 마지막 로그 시각까지이며, 스레드 사이 휴지시간은 제외하였다.</w:t>
       </w:r>
     </w:p>
     <w:p>
@@ -12699,17 +12708,35 @@
       </w:pPr>
       <w:r>
         <w:rPr>
-          <w:b w:val="1"/>
-          <w:bCs w:val="1"/>
+          <w:b w:val="0"/>
+          <w:bCs w:val="0"/>
           <w:rtl w:val="0"/>
         </w:rPr>
-        <w:t xml:space="preserve">2) </w:t>
+        <w:t xml:space="preserve">1) 참가자마다 Task 1과 Task 2의 로그 기반 수행시간을 각각 산출한 뒤 합산하였다. 각 과제의 시간 범위는 스레드의 첫 요청부터 마지막 로그 시각까지이며, 스레드 사이 휴지시간은 제외하였다. 이 값은 로그에 기록된 수행 구간의 길이로 해석하며, 정답 도달까지의 완료시간과 일치하는지는 별도 확인이 필요하다.</w:t>
       </w:r>
       <w:r>
         <w:rPr>
           <w:rtl w:val="0"/>
         </w:rPr>
-        <w:t xml:space="preserve">프롬프트 수 역시 두 과제의 사용자 입력을 합산하였다. A2UI의 plan→confirm 과정은 하나의 프롬프트로 보고 confirmed_execution은 별도 사용자 입력이 아니므로 제외하였다.</w:t>
+      </w:r>
+    </w:p>
+    <w:p>
+      <w:pPr>
+        <w:ind w:left="113" w:firstLine="0"/>
+        <w:rPr/>
+      </w:pPr>
+      <w:r>
+        <w:rPr>
+          <w:b w:val="0"/>
+          <w:bCs w:val="0"/>
+          <w:rtl w:val="0"/>
+        </w:rPr>
+        <w:t xml:space="preserve">2) 프롬프트 수는 두 과제의 사용자 요청 수를 합산하였다. A2UI의 계획 생성과 실행 확인(plan→confirm)은 한 번의 요청으로 집계하였으며, 확인 동작에 해당하는 confirmed_execution은 별도 프롬프트로 세지 않았다. 따라서 프롬프트 수는 전체 클릭 수나 전체 상호작용 횟수를 의미하지 않는다.</w:t>
+      </w:r>
+      <w:r>
+        <w:rPr>
+          <w:rtl w:val="0"/>
+        </w:rPr>
       </w:r>
     </w:p>
     <w:p>
@@ -12802,7 +12829,7 @@
           <w:vertAlign w:val="baseline"/>
           <w:rtl w:val="0"/>
         </w:rPr>
-        <w:t xml:space="preserve">표 7. 참가자별 두 과제 합산 수행시간과 프롬프트 수</w:t>
+        <w:t xml:space="preserve">표 6. 참가자별 두 과제 합산 수행시간과 프롬프트 수</w:t>
       </w:r>
     </w:p>
     <w:tbl>
@@ -13656,7 +13683,7 @@
           <w:vertAlign w:val="baseline"/>
           <w:rtl w:val="0"/>
         </w:rPr>
-        <w:t xml:space="preserve">주. 동일 참가자의 Task 1과 Task 2를 합산한 값이다. A2UI confirmed_execution은 프롬프트 수에서 제외하였다. 출처: 05번.</w:t>
+        <w:t xml:space="preserve">주. 동일 참가자의 Task 1과 Task 2를 합산한 값이다. A2UI confirmed_execution은 프롬프트 수에서 제외하였다. 분석자료: 05번.</w:t>
       </w:r>
     </w:p>
     <w:p>
@@ -13695,8 +13722,8 @@
       <w:r>
         <w:rPr>
           <w:rFonts w:ascii="Noto Sans" w:cs="Noto Sans" w:eastAsia="Noto Sans" w:hAnsi="Noto Sans"/>
-          <w:b w:val="1"/>
-          <w:bCs w:val="1"/>
+          <w:b w:val="0"/>
+          <w:bCs w:val="0"/>
           <w:i w:val="0"/>
           <w:iCs w:val="0"/>
           <w:smallCaps w:val="0"/>
@@ -13710,6 +13737,11 @@
           <w:rtl w:val="0"/>
         </w:rPr>
         <w:t xml:space="preserve">표를 통해 알 수 있는 점</w:t>
+      </w:r>
+      <w:r>
+        <w:rPr>
+          <w:rtl w:val="0"/>
+        </w:rPr>
       </w:r>
     </w:p>
     <w:p>
@@ -13759,11 +13791,11 @@
       </w:pPr>
       <w:r>
         <w:rPr>
-          <w:b w:val="1"/>
-          <w:bCs w:val="1"/>
+          <w:b w:val="0"/>
+          <w:bCs w:val="0"/>
           <w:rtl w:val="0"/>
         </w:rPr>
-        <w:t xml:space="preserve">3) 그러나 이 표는 기술통계이다. UI나 숙련도 차이가 통계적으로 유의한지는 표 10의 3요인 F 검정 결과를 함께 확인해야 한다.</w:t>
+        <w:t xml:space="preserve">3) 그러나 이 표는 기술통계이다. UI나 AI 리터러시 수준 차이가 통계적으로 유의한지는 표 8의 3요인 F 검정 결과를 함께 확인해야 한다.</w:t>
       </w:r>
       <w:r>
         <w:rPr>
@@ -13779,9 +13811,15 @@
       </w:pPr>
       <w:r>
         <w:rPr>
+          <w:color w:val="000000"/>
           <w:rtl w:val="0"/>
         </w:rPr>
-        <w:t xml:space="preserve">5.2 3-1. Number of Prompts</w:t>
+        <w:t xml:space="preserve">5.2 UI 유형별 프롬프트 수</w:t>
+      </w:r>
+      <w:r>
+        <w:rPr>
+          <w:rtl w:val="0"/>
+        </w:rPr>
       </w:r>
     </w:p>
     <w:p>
@@ -13820,8 +13858,8 @@
       <w:r>
         <w:rPr>
           <w:rFonts w:ascii="Noto Sans" w:cs="Noto Sans" w:eastAsia="Noto Sans" w:hAnsi="Noto Sans"/>
-          <w:b w:val="1"/>
-          <w:bCs w:val="1"/>
+          <w:b w:val="0"/>
+          <w:bCs w:val="0"/>
           <w:i w:val="0"/>
           <w:iCs w:val="0"/>
           <w:smallCaps w:val="0"/>
@@ -13835,6 +13873,11 @@
           <w:rtl w:val="0"/>
         </w:rPr>
         <w:t xml:space="preserve">계산 과정</w:t>
+      </w:r>
+      <w:r>
+        <w:rPr>
+          <w:rtl w:val="0"/>
+        </w:rPr>
       </w:r>
     </w:p>
     <w:p>
@@ -13864,17 +13907,16 @@
       </w:pPr>
       <w:r>
         <w:rPr>
-          <w:b w:val="1"/>
-          <w:bCs w:val="1"/>
+          <w:b w:val="0"/>
+          <w:bCs w:val="0"/>
           <w:rtl w:val="0"/>
         </w:rPr>
-        <w:t xml:space="preserve">2) </w:t>
+        <w:t xml:space="preserve">2) A2UI의 confirmed_execution 및 기존 로그 정제 기준에 따라 제외된 행은 프롬프트 수에 포함하지 않았다. 재현 가능한 보고를 위해 제외 사유별 기준과 제외 건수를 분석 기록에 명시해야 한다.</w:t>
       </w:r>
       <w:r>
         <w:rPr>
           <w:rtl w:val="0"/>
         </w:rPr>
-        <w:t xml:space="preserve">A2UI의 confirmed_execution과 정제 과정에서 제외된 행은 프롬프트 수에 포함하지 않았다.</w:t>
       </w:r>
     </w:p>
     <w:p>
@@ -13967,7 +14009,7 @@
           <w:vertAlign w:val="baseline"/>
           <w:rtl w:val="0"/>
         </w:rPr>
-        <w:t xml:space="preserve">표 8. UI 유형별 Number of Prompts 기술통계 (전체, N = 40)</w:t>
+        <w:t xml:space="preserve">표 7. UI 유형별 프롬프트 수 기술통계 (전체, N = 40)</w:t>
       </w:r>
     </w:p>
     <w:tbl>
@@ -14858,7 +14900,7 @@
           <w:vertAlign w:val="baseline"/>
           <w:rtl w:val="0"/>
         </w:rPr>
-        <w:t xml:space="preserve">주. 참가자별 두 과제 프롬프트 수를 합산하였다. 출처: 05번 3-1.</w:t>
+        <w:t xml:space="preserve">주. 참가자별 두 과제 프롬프트 수를 합산하였다. 분석자료: 05번 3-1.</w:t>
       </w:r>
     </w:p>
     <w:p>
@@ -14897,8 +14939,8 @@
       <w:r>
         <w:rPr>
           <w:rFonts w:ascii="Noto Sans" w:cs="Noto Sans" w:eastAsia="Noto Sans" w:hAnsi="Noto Sans"/>
-          <w:b w:val="1"/>
-          <w:bCs w:val="1"/>
+          <w:b w:val="0"/>
+          <w:bCs w:val="0"/>
           <w:i w:val="0"/>
           <w:iCs w:val="0"/>
           <w:smallCaps w:val="0"/>
@@ -14912,6 +14954,11 @@
           <w:rtl w:val="0"/>
         </w:rPr>
         <w:t xml:space="preserve">표를 통해 알 수 있는 점</w:t>
+      </w:r>
+      <w:r>
+        <w:rPr>
+          <w:rtl w:val="0"/>
+        </w:rPr>
       </w:r>
     </w:p>
     <w:p>
@@ -14941,17 +14988,16 @@
       </w:pPr>
       <w:r>
         <w:rPr>
-          <w:b w:val="1"/>
-          <w:bCs w:val="1"/>
+          <w:b w:val="0"/>
+          <w:bCs w:val="0"/>
           <w:rtl w:val="0"/>
         </w:rPr>
-        <w:t xml:space="preserve">2) </w:t>
+        <w:t xml:space="preserve">2) 두 집단의 최솟값과 최댓값으로 나타낸 범위가 겹쳤다. 집단 평균만으로 UI에 따른 차이를 확정할 수 없으며, 추론통계 결과를 함께 확인해야 한다.</w:t>
       </w:r>
       <w:r>
         <w:rPr>
           <w:rtl w:val="0"/>
         </w:rPr>
-        <w:t xml:space="preserve">하지만 두 집단의 최소·최대 범위와 개별 분포가 크게 겹친다. 즉 참가자마다 프롬프트 수 차이가 있어 집단 평균만으로 분명한 UI 차이라고 보기 어렵다.</w:t>
       </w:r>
     </w:p>
     <w:p>
@@ -14961,11 +15007,11 @@
       </w:pPr>
       <w:r>
         <w:rPr>
-          <w:b w:val="1"/>
-          <w:bCs w:val="1"/>
+          <w:b w:val="0"/>
+          <w:bCs w:val="0"/>
           <w:rtl w:val="0"/>
         </w:rPr>
-        <w:t xml:space="preserve">3) 표 10의 Number of Prompts에 대한 UI 주효과는 F(1, 39)=0.254, p=.617로 유의하지 않았다. 따라서 “A2UI가 프롬프트 수를 유의하게 줄였다”라고 결론내리지 않는다.</w:t>
+        <w:t xml:space="preserve">3) 표 8의 프롬프트 수에 대한 UI 주효과는 F(1, 39)=0.254, p=.617로 유의하지 않았다. 따라서 “A2UI가 프롬프트 수를 유의하게 줄였다”라고 결론내리지 않는다.</w:t>
       </w:r>
       <w:r>
         <w:rPr>
@@ -14984,12 +15030,12 @@
           <wp:inline distB="0" distT="0" distL="114300" distR="114300">
             <wp:extent cx="4406738" cy="3290692"/>
             <wp:effectExtent b="0" l="0" r="0" t="0"/>
-            <wp:docPr id="9" name="image1.png"/>
+            <wp:docPr id="11" name="image2.png"/>
             <a:graphic>
               <a:graphicData uri="http://schemas.openxmlformats.org/drawingml/2006/picture">
                 <pic:pic>
                   <pic:nvPicPr>
-                    <pic:cNvPr id="0" name="image1.png"/>
+                    <pic:cNvPr id="0" name="image2.png"/>
                     <pic:cNvPicPr preferRelativeResize="0"/>
                   </pic:nvPicPr>
                   <pic:blipFill>
@@ -15032,7 +15078,7 @@
           <w:szCs w:val="17"/>
           <w:rtl w:val="0"/>
         </w:rPr>
-        <w:t xml:space="preserve">그림 3. UI 조건별 Number of Prompts 분포</w:t>
+        <w:t xml:space="preserve">그림 2. UI 조건별 프롬프트 수 분포</w:t>
       </w:r>
       <w:r>
         <w:rPr>
@@ -15076,7 +15122,7 @@
           <w:vertAlign w:val="baseline"/>
           <w:rtl w:val="0"/>
         </w:rPr>
-        <w:t xml:space="preserve">주. 참가자별 두 과제 프롬프트 수 합산 분포이다. 점은 개별 참가자 값을 나타내며 A2UI confirmed_execution은 제외하였다. 출처: 05번.</w:t>
+        <w:t xml:space="preserve">주. 참가자별 두 과제 프롬프트 수 합산 분포이다. 점은 개별 참가자 값을 나타내며 A2UI confirmed_execution은 제외하였다. 분석자료: 05번.</w:t>
       </w:r>
       <w:r>
         <w:rPr>
@@ -15092,9 +15138,15 @@
       </w:pPr>
       <w:r>
         <w:rPr>
+          <w:color w:val="000000"/>
           <w:rtl w:val="0"/>
         </w:rPr>
-        <w:t xml:space="preserve">5.4 행동지표에 대한 3요인 F 검정</w:t>
+        <w:t xml:space="preserve">5.3 행동지표에 대한 3요인 F 검정</w:t>
+      </w:r>
+      <w:r>
+        <w:rPr>
+          <w:rtl w:val="0"/>
+        </w:rPr>
       </w:r>
     </w:p>
     <w:p>
@@ -15133,8 +15185,8 @@
       <w:r>
         <w:rPr>
           <w:rFonts w:ascii="Noto Sans" w:cs="Noto Sans" w:eastAsia="Noto Sans" w:hAnsi="Noto Sans"/>
-          <w:b w:val="1"/>
-          <w:bCs w:val="1"/>
+          <w:b w:val="0"/>
+          <w:bCs w:val="0"/>
           <w:i w:val="0"/>
           <w:iCs w:val="0"/>
           <w:smallCaps w:val="0"/>
@@ -15148,6 +15200,11 @@
           <w:rtl w:val="0"/>
         </w:rPr>
         <w:t xml:space="preserve">계산 과정</w:t>
+      </w:r>
+      <w:r>
+        <w:rPr>
+          <w:rtl w:val="0"/>
+        </w:rPr>
       </w:r>
     </w:p>
     <w:p>
@@ -15177,17 +15234,16 @@
       </w:pPr>
       <w:r>
         <w:rPr>
-          <w:b w:val="1"/>
-          <w:bCs w:val="1"/>
+          <w:b w:val="0"/>
+          <w:bCs w:val="0"/>
           <w:rtl w:val="0"/>
         </w:rPr>
-        <w:t xml:space="preserve">2) </w:t>
+        <w:t xml:space="preserve">2) 모형에는 UI, AI 리터러시 수준, Task와 이들의 모든 2원 및 3원 상호작용을 포함하였다. 과제 순서는 모형에서 제외하였다.</w:t>
       </w:r>
       <w:r>
         <w:rPr>
           <w:rtl w:val="0"/>
         </w:rPr>
-        <w:t xml:space="preserve">모형에는 UI, 숙련도, Task와 이들의 모든 2원 및 3원 상호작용을 포함하였다. 과제 순서는 모형에서 제외하였다.</w:t>
       </w:r>
     </w:p>
     <w:p>
@@ -15217,11 +15273,13 @@
       </w:pPr>
       <w:r>
         <w:rPr>
+          <w:b w:val="0"/>
+          <w:bCs w:val="0"/>
           <w:i w:val="1"/>
           <w:iCs w:val="1"/>
           <w:rtl w:val="0"/>
         </w:rPr>
-        <w:t xml:space="preserve">분석식: Number of Prompts(또는 수행시간) ~ UI × 숙련도 × Task</w:t>
+        <w:t xml:space="preserve">분석식: 프롬프트 수(또는 수행시간) ~ UI × AI 리터러시 수준 × Task</w:t>
       </w:r>
       <w:r>
         <w:rPr>
@@ -15279,7 +15337,7 @@
           <w:vertAlign w:val="baseline"/>
           <w:rtl w:val="0"/>
         </w:rPr>
-        <w:t xml:space="preserve">표 10. 행동지표에 대한 3요인 F 검정 결과</w:t>
+        <w:t xml:space="preserve">표 8. 행동지표에 대한 3요인 F 검정 결과</w:t>
       </w:r>
     </w:p>
     <w:tbl>
@@ -15496,7 +15554,7 @@
                 <w:szCs w:val="17"/>
                 <w:rtl w:val="0"/>
               </w:rPr>
-              <w:t xml:space="preserve">Number of Prompts</w:t>
+              <w:t xml:space="preserve">프롬프트 수</w:t>
             </w:r>
             <w:r>
               <w:rPr>
@@ -16078,7 +16136,7 @@
                 <w:szCs w:val="17"/>
                 <w:rtl w:val="0"/>
               </w:rPr>
-              <w:t xml:space="preserve">숙련도</w:t>
+              <w:t xml:space="preserve">AI 리터러시 수준</w:t>
             </w:r>
             <w:r>
               <w:rPr>
@@ -16608,7 +16666,7 @@
                 <w:szCs w:val="17"/>
                 <w:rtl w:val="0"/>
               </w:rPr>
-              <w:t xml:space="preserve">UI × 숙련도</w:t>
+              <w:t xml:space="preserve">UI × AI 리터러시 수준</w:t>
             </w:r>
             <w:r>
               <w:rPr>
@@ -17138,7 +17196,7 @@
                 <w:szCs w:val="17"/>
                 <w:rtl w:val="0"/>
               </w:rPr>
-              <w:t xml:space="preserve">숙련도 × Task</w:t>
+              <w:t xml:space="preserve">AI 리터러시 수준 × Task</w:t>
             </w:r>
             <w:r>
               <w:rPr>
@@ -17403,7 +17461,7 @@
                 <w:szCs w:val="17"/>
                 <w:rtl w:val="0"/>
               </w:rPr>
-              <w:t xml:space="preserve">UI × 숙련도 × Task</w:t>
+              <w:t xml:space="preserve">UI × AI 리터러시 수준 × Task</w:t>
             </w:r>
             <w:r>
               <w:rPr>
@@ -17676,7 +17734,7 @@
           <w:szCs w:val="15"/>
           <w:rtl w:val="0"/>
         </w:rPr>
-        <w:t xml:space="preserve">주. 40명×2개 과제의 반복측정 자료. 참가자 ID로 군집화한 강건 표준오차와 소표본 보정 F 검정을 사용하였다. NumDF=효과 자유도, DenDF=분모 자유도. 모든 효과는 F(1, 39)로 검정하였다. 과제 순서는 모형에서 제외하였다. p값은 다중검정 보정 전. 출처: 05번.</w:t>
+        <w:t xml:space="preserve">주. 40명×2개 과제의 반복측정 자료. 참가자 ID로 군집화한 강건 표준오차와 소표본 보정 F 검정을 사용하였다. NumDF=효과 자유도, DenDF=분모 자유도. 모든 효과는 F(1, 39)로 검정하였다. 과제 순서는 모형에서 제외하였다. p값은 다중검정 보정 전. 분석자료: 05번.</w:t>
       </w:r>
       <w:r>
         <w:rPr>
@@ -17720,8 +17778,8 @@
       <w:r>
         <w:rPr>
           <w:rFonts w:ascii="Noto Sans" w:cs="Noto Sans" w:eastAsia="Noto Sans" w:hAnsi="Noto Sans"/>
-          <w:b w:val="1"/>
-          <w:bCs w:val="1"/>
+          <w:b w:val="0"/>
+          <w:bCs w:val="0"/>
           <w:i w:val="0"/>
           <w:iCs w:val="0"/>
           <w:smallCaps w:val="0"/>
@@ -17736,25 +17794,10 @@
         </w:rPr>
         <w:t xml:space="preserve">표를 통해 알 수 있는 점</w:t>
       </w:r>
-    </w:p>
-    <w:p>
-      <w:pPr>
-        <w:ind w:left="113" w:firstLine="0"/>
-        <w:rPr/>
-      </w:pPr>
-      <w:r>
-        <w:rPr>
-          <w:b w:val="1"/>
-          <w:bCs w:val="1"/>
-          <w:rtl w:val="0"/>
-        </w:rPr>
-        <w:t xml:space="preserve">1) </w:t>
-      </w:r>
       <w:r>
         <w:rPr>
           <w:rtl w:val="0"/>
         </w:rPr>
-        <w:t xml:space="preserve">가장 분명한 결과는 Task의 주효과이다. 수행시간은 F(1, 39)=32.246, p&lt;.001, Number of Prompts는 F(1, 39)=19.361, p&lt;.001로 두 지표 모두 유의했다.</w:t>
       </w:r>
     </w:p>
     <w:p>
@@ -17764,17 +17807,16 @@
       </w:pPr>
       <w:r>
         <w:rPr>
-          <w:b w:val="1"/>
-          <w:bCs w:val="1"/>
+          <w:b w:val="0"/>
+          <w:bCs w:val="0"/>
           <w:rtl w:val="0"/>
         </w:rPr>
-        <w:t xml:space="preserve">2) </w:t>
+        <w:t xml:space="preserve">1) 가장 분명한 결과는 Task의 주효과이다. 수행시간은 F(1, 39)=32.246, p&lt;.001, 프롬프트 수는 F(1, 39)=19.361, p&lt;.001로 두 지표 모두 유의했다.</w:t>
       </w:r>
       <w:r>
         <w:rPr>
           <w:rtl w:val="0"/>
         </w:rPr>
-        <w:t xml:space="preserve">UI 주효과는 수행시간 p=.852, Number of Prompts p=.617로 유의하지 않았다. 즉 행동 효율성 측면에서 A2UI가 Baseline보다 확실히 빠르거나 프롬프트가 적다고 입증되지는 않았다.</w:t>
       </w:r>
     </w:p>
     <w:p>
@@ -17784,17 +17826,16 @@
       </w:pPr>
       <w:r>
         <w:rPr>
-          <w:b w:val="1"/>
-          <w:bCs w:val="1"/>
+          <w:b w:val="0"/>
+          <w:bCs w:val="0"/>
           <w:rtl w:val="0"/>
         </w:rPr>
-        <w:t xml:space="preserve">3) </w:t>
+        <w:t xml:space="preserve">2) UI 주효과는 수행시간 p=.852, 프롬프트 수 p=.617로 유의하지 않았다. 즉 행동 효율성 측면에서 A2UI가 Baseline보다 확실히 빠르거나 프롬프트가 적다고 입증되지는 않았다.</w:t>
       </w:r>
       <w:r>
         <w:rPr>
           <w:rtl w:val="0"/>
         </w:rPr>
-        <w:t xml:space="preserve">숙련도 주효과도 수행시간 p=.153, Number of Prompts p=.338로 유의하지 않았고, UI×숙련도, UI×Task, 숙련도×Task 상호작용도 모두 .05 기준에서 유의하지 않았다.</w:t>
       </w:r>
     </w:p>
     <w:p>
@@ -17804,17 +17845,35 @@
       </w:pPr>
       <w:r>
         <w:rPr>
-          <w:b w:val="1"/>
-          <w:bCs w:val="1"/>
+          <w:b w:val="0"/>
+          <w:bCs w:val="0"/>
           <w:rtl w:val="0"/>
         </w:rPr>
-        <w:t xml:space="preserve">4) </w:t>
+        <w:t xml:space="preserve">3) AI 리터러시 수준 주효과도 수행시간 p=.153, 프롬프트 수 p=.338로 유의하지 않았고, UI×AI 리터러시 수준, UI×Task, AI 리터러시 수준×Task 상호작용도 모두 .05 기준에서 유의하지 않았다.</w:t>
       </w:r>
       <w:r>
         <w:rPr>
           <w:rtl w:val="0"/>
         </w:rPr>
-        <w:t xml:space="preserve">UI×숙련도×Task의 3원 상호작용 역시 수행시간 p=.241, Number of Prompts p=.143으로 유의하지 않았다. 따라서 Task에 따른 차이가 UI나 숙련도에 따라 달라진다는 근거는 확인되지 않았다.</w:t>
+      </w:r>
+    </w:p>
+    <w:p>
+      <w:pPr>
+        <w:ind w:left="113" w:firstLine="0"/>
+        <w:rPr/>
+      </w:pPr>
+      <w:r>
+        <w:rPr>
+          <w:b w:val="0"/>
+          <w:bCs w:val="0"/>
+          <w:rtl w:val="0"/>
+        </w:rPr>
+        <w:t xml:space="preserve">4) UI×AI 리터러시 수준×Task의 3원 상호작용은 수행시간 p=.241, 프롬프트 수 p=.143으로 유의하지 않았다. 따라서 과제에 따른 차이가 UI와 AI 리터러시 수준의 조합에 따라 달라진다는 통계적 근거는 확인되지 않았다.</w:t>
+      </w:r>
+      <w:r>
+        <w:rPr>
+          <w:rtl w:val="0"/>
+        </w:rPr>
       </w:r>
     </w:p>
     <w:p>
@@ -17836,9 +17895,15 @@
       </w:pPr>
       <w:r>
         <w:rPr>
+          <w:color w:val="000000"/>
           <w:rtl w:val="0"/>
         </w:rPr>
-        <w:t xml:space="preserve">5.5 UI 유형별 두 과제 최종 완료 여부</w:t>
+        <w:t xml:space="preserve">5.4 UI 유형별 두 과제 최종 완료 여부</w:t>
+      </w:r>
+      <w:r>
+        <w:rPr>
+          <w:rtl w:val="0"/>
+        </w:rPr>
       </w:r>
     </w:p>
     <w:p>
@@ -17877,8 +17942,8 @@
       <w:r>
         <w:rPr>
           <w:rFonts w:ascii="Noto Sans" w:cs="Noto Sans" w:eastAsia="Noto Sans" w:hAnsi="Noto Sans"/>
-          <w:b w:val="1"/>
-          <w:bCs w:val="1"/>
+          <w:b w:val="0"/>
+          <w:bCs w:val="0"/>
           <w:i w:val="0"/>
           <w:iCs w:val="0"/>
           <w:smallCaps w:val="0"/>
@@ -17892,6 +17957,11 @@
           <w:rtl w:val="0"/>
         </w:rPr>
         <w:t xml:space="preserve">계산 과정</w:t>
+      </w:r>
+      <w:r>
+        <w:rPr>
+          <w:rtl w:val="0"/>
+        </w:rPr>
       </w:r>
     </w:p>
     <w:p>
@@ -18024,7 +18094,7 @@
           <w:vertAlign w:val="baseline"/>
           <w:rtl w:val="0"/>
         </w:rPr>
-        <w:t xml:space="preserve">표 11. UI 유형별 두 과제 최종 완료 여부</w:t>
+        <w:t xml:space="preserve">표 9. UI 유형별 두 과제 최종 완료 여부</w:t>
       </w:r>
     </w:p>
     <w:tbl>
@@ -18740,7 +18810,7 @@
           <w:vertAlign w:val="baseline"/>
           <w:rtl w:val="0"/>
         </w:rPr>
-        <w:t xml:space="preserve">주. 30분 제한을 적용하지 않은 최종 재분류 기준이며 시스템 오류 및 후속 완료 사례 재분류가 반영되었다. Fisher 정확검정 p=1.000. 출처: 05번.</w:t>
+        <w:t xml:space="preserve">주. 30분 제한을 적용하지 않은 최종 재분류 기준이며 시스템 오류 및 후속 완료 사례 재분류가 반영되었다. Fisher 정확검정 p=1.000. 분석자료: 05번.</w:t>
       </w:r>
     </w:p>
     <w:p>
@@ -18779,8 +18849,8 @@
       <w:r>
         <w:rPr>
           <w:rFonts w:ascii="Noto Sans" w:cs="Noto Sans" w:eastAsia="Noto Sans" w:hAnsi="Noto Sans"/>
-          <w:b w:val="1"/>
-          <w:bCs w:val="1"/>
+          <w:b w:val="0"/>
+          <w:bCs w:val="0"/>
           <w:i w:val="0"/>
           <w:iCs w:val="0"/>
           <w:smallCaps w:val="0"/>
@@ -18795,6 +18865,11 @@
         </w:rPr>
         <w:t xml:space="preserve">표를 통해 알 수 있는 점</w:t>
       </w:r>
+      <w:r>
+        <w:rPr>
+          <w:rtl w:val="0"/>
+        </w:rPr>
+      </w:r>
     </w:p>
     <w:p>
       <w:pPr>
@@ -18803,17 +18878,16 @@
       </w:pPr>
       <w:r>
         <w:rPr>
-          <w:b w:val="1"/>
-          <w:bCs w:val="1"/>
+          <w:b w:val="0"/>
+          <w:bCs w:val="0"/>
           <w:rtl w:val="0"/>
         </w:rPr>
-        <w:t xml:space="preserve">1) </w:t>
+        <w:t xml:space="preserve">1) 최종 완료율은 A2UI 80.0%, Baseline 85.0%로, Baseline이 5%p 높았다. 완료 인원은 각각 16명과 17명으로 1명 차이였다.</w:t>
       </w:r>
       <w:r>
         <w:rPr>
           <w:rtl w:val="0"/>
         </w:rPr>
-        <w:t xml:space="preserve">최종 완료율은 A2UI 80.0%, Baseline 85.0%로 Baseline이 5%p 높았지만, 표본 수로 보면 16명과 17명의 차이로 매우 작다.</w:t>
       </w:r>
     </w:p>
     <w:p>
@@ -18863,17 +18937,16 @@
       </w:pPr>
       <w:r>
         <w:rPr>
-          <w:b w:val="1"/>
-          <w:bCs w:val="1"/>
+          <w:b w:val="0"/>
+          <w:bCs w:val="0"/>
           <w:rtl w:val="0"/>
         </w:rPr>
-        <w:t xml:space="preserve">4) </w:t>
+        <w:t xml:space="preserve">4) 이 완료율은 30분 제한을 적용하지 않은 최종 재분류 결과이다. 제한시간 내 완료율과 구분하여 보고하고, 완료의 판정 기준 및 시스템 오류·후속 완료 사례의 재분류 기준을 명시해야 한다.</w:t>
       </w:r>
       <w:r>
         <w:rPr>
           <w:rtl w:val="0"/>
         </w:rPr>
-        <w:t xml:space="preserve">이 완료율은 30분 제한을 적용하지 않은 최종 재분류 결과이므로, 같은 세션 안에서 제한시간 내 완료율과는 구분해서 설명해야 한다.</w:t>
       </w:r>
     </w:p>
     <w:p>
@@ -18895,9 +18968,15 @@
       </w:pPr>
       <w:r>
         <w:rPr>
+          <w:color w:val="000000"/>
           <w:rtl w:val="0"/>
         </w:rPr>
-        <w:t xml:space="preserve">7. 논문 본문에 사용할 수 있는 종합 해석</w:t>
+        <w:t xml:space="preserve">6. 종합 해석</w:t>
+      </w:r>
+      <w:r>
+        <w:rPr>
+          <w:rtl w:val="0"/>
+        </w:rPr>
       </w:r>
     </w:p>
     <w:p>
@@ -18906,17 +18985,16 @@
       </w:pPr>
       <w:r>
         <w:rPr>
-          <w:b w:val="1"/>
-          <w:bCs w:val="1"/>
+          <w:b w:val="0"/>
+          <w:bCs w:val="0"/>
           <w:rtl w:val="0"/>
         </w:rPr>
-        <w:t xml:space="preserve">권장 서술. </w:t>
+        <w:t xml:space="preserve">본 연구에서 A2UI는 Baseline에 비해 긍정적 사용자 평가 변수의 평균이 높고 인지부하의 평균이 낮았다. 표 5의 다중검정 보정 전 결과에서 UI 유형의 주효과는 전반적 만족도(SAT)와 결과 신뢰도·품질(TQ)에서 유의하였다. AI 리터러시 수준의 주효과는 지각된 유용성, 전반적 만족도, 결과 신뢰도·품질, 상호작용 품질 및 재사용 의도에서 유의하였다. 인지부하에서는 UI 유형과 AI 리터러시 수준의 상호작용이 나타나 네 조건의 평균과 단순효과에 대한 추가 검토가 필요하다. 행동지표에서는 과제 유형의 주효과가 수행시간과 프롬프트 수 모두에서 유의하였으나, UI 주효과는 유의하지 않았다. 최종 완료율에서도 UI 간 차이는 통계적으로 확인되지 않았다. 이 결과는 일부 주관적 평가에서 UI와 관련된 차이가 관찰되었지만, 수행시간·프롬프트 수·최종 완료율의 개선까지 일관되게 확인된 것은 아님을 보여준다.</w:t>
       </w:r>
       <w:r>
         <w:rPr>
           <w:rtl w:val="0"/>
         </w:rPr>
-        <w:t xml:space="preserve">본 연구에서 A2UI는 Baseline 대비 주관적 사용자 평가에서 전반적으로 긍정적인 평균 경향을 보였으나, UI 유형의 주효과는 통계적으로 유의하지 않았다. 반면 AI 리터러시는 지각된 유용성, 결과 신뢰도·품질, 상호작용 품질 및 재사용 의도에서 유의한 주효과를 보였고, 행동 로그에서는 Task의 주효과가 수행시간과 프롬프트 수 모두에서 유의하였다. 따라서 현 표본에서는 A2UI의 통계적 우월성보다 사용자 AI 리터러시와 과제 복잡도가 일부 주관적 평가 및 실제 상호작용 비용과 더 뚜렷하게 관련된 것으로 해석하는 것이 적절하다.</w:t>
       </w:r>
     </w:p>
     <w:p>
@@ -18925,17 +19003,16 @@
       </w:pPr>
       <w:r>
         <w:rPr>
-          <w:b w:val="1"/>
-          <w:bCs w:val="1"/>
+          <w:b w:val="0"/>
+          <w:bCs w:val="0"/>
           <w:rtl w:val="0"/>
         </w:rPr>
-        <w:t xml:space="preserve">해석 시 주의. </w:t>
+        <w:t xml:space="preserve">해석 범위. 비유의한 결과를 효과가 없다는 증거 또는 두 UI가 동등하다는 증거로 해석하지 않는다. AI 리터러시와 주관적 평가의 관련성을 인과관계로 단정하지 않으며, 한 효과의 유의성과 다른 효과의 비유의성만으로 효과크기의 우열을 판단하지 않는다. 추가 분석은 목적과 근거를 명시하고 기존 분석과 구분하여 보고한다.</w:t>
       </w:r>
       <w:r>
         <w:rPr>
           <w:rtl w:val="0"/>
         </w:rPr>
-        <w:t xml:space="preserve">유의한 결과를 만들기 위해 분석방법, 제외 기준 또는 표본을 사후적으로 변경해서는 안 된다. 추가 분석은 기존 결과를 대체하기 위한 것이 아니라 결과의 강건성과 해석 범위를 확인하는 민감도 분석으로 구분하여 보고하는 것이 바람직하다.</w:t>
       </w:r>
     </w:p>
     <w:p>
@@ -18956,6 +19033,109 @@
         <w:rPr>
           <w:rtl w:val="0"/>
         </w:rPr>
+      </w:r>
+    </w:p>
+    <w:p>
+      <w:pPr>
+        <w:pStyle w:val="Heading1"/>
+        <w:pageBreakBefore w:val="1"/>
+        <w:rPr/>
+      </w:pPr>
+      <w:r>
+        <w:rPr>
+          <w:color w:val="000000"/>
+          <w:rtl w:val="0"/>
+        </w:rPr>
+        <w:t xml:space="preserve">7. 최종 보고 전 확인 사항</w:t>
+      </w:r>
+      <w:r>
+        <w:rPr>
+          <w:rtl w:val="0"/>
+        </w:rPr>
+      </w:r>
+    </w:p>
+    <w:p>
+      <w:pPr>
+        <w:spacing w:after="120" w:line="300" w:lineRule="auto"/>
+        <w:rPr/>
+      </w:pPr>
+      <w:r>
+        <w:rPr>
+          <w:rtl w:val="0"/>
+        </w:rPr>
+        <w:t xml:space="preserve">1) AI 리터러시 분류: 6.0을 기준으로 나눈 근거와 기준 선정 시점을 명시한다. 상대적 분류인지 절대적 수준 판단인지 구분하고, 연속 점수를 이분화한 데 따른 정보 손실을 한계로 설명한다.</w:t>
+      </w:r>
+    </w:p>
+    <w:p>
+      <w:pPr>
+        <w:spacing w:after="120" w:line="300" w:lineRule="auto"/>
+        <w:rPr/>
+      </w:pPr>
+      <w:r>
+        <w:rPr>
+          <w:rtl w:val="0"/>
+        </w:rPr>
+        <w:t xml:space="preserve">2) 측정도구: 척도의 출처, 구성개념별 문항 배정, 역문항 처리 및 결측값 처리 기준을 확인한다. AI 리터러시 수준과 별도로 측정한 숙련도가 있다면 두 변수를 구분하여 기술한다.</w:t>
+      </w:r>
+    </w:p>
+    <w:p>
+      <w:pPr>
+        <w:spacing w:after="120" w:line="300" w:lineRule="auto"/>
+        <w:rPr/>
+      </w:pPr>
+      <w:r>
+        <w:rPr>
+          <w:rtl w:val="0"/>
+        </w:rPr>
+        <w:t xml:space="preserve">3) 사후설문 분석: 표 5의 수치와 원출력을 대조한다. 효과 코딩, 잔차 정규성·등분산성, 효과크기 및 신뢰구간을 확인한다. 다중검정의 범위와 보정 또는 탐색적 해석 방침을 명시한다.</w:t>
+      </w:r>
+    </w:p>
+    <w:p>
+      <w:pPr>
+        <w:spacing w:after="120" w:line="300" w:lineRule="auto"/>
+        <w:rPr/>
+      </w:pPr>
+      <w:r>
+        <w:rPr>
+          <w:rtl w:val="0"/>
+        </w:rPr>
+        <w:t xml:space="preserve">4) 인지부하 상호작용: 네 조건의 평균과 표준편차를 제시하고, 단순효과 검정 및 필요한 다중비교 보정을 통해 상호작용의 방향을 검토한다.</w:t>
+      </w:r>
+    </w:p>
+    <w:p>
+      <w:pPr>
+        <w:spacing w:after="120" w:line="300" w:lineRule="auto"/>
+        <w:rPr/>
+      </w:pPr>
+      <w:r>
+        <w:rPr>
+          <w:rtl w:val="0"/>
+        </w:rPr>
+        <w:t xml:space="preserve">5) 행동 로그: 첫 요청과 마지막 로그의 이벤트 정의, 미완료 참가자의 시간 처리, 정제 제외 사유 및 건수를 명시한다. 표 8의 군집 강건 표준오차와 소표본 보정 방식은 실제 코드와 대조하고, 과제 순서 제외의 근거를 설명한다.</w:t>
+      </w:r>
+    </w:p>
+    <w:p>
+      <w:pPr>
+        <w:spacing w:after="120" w:line="300" w:lineRule="auto"/>
+        <w:rPr/>
+      </w:pPr>
+      <w:r>
+        <w:rPr>
+          <w:rtl w:val="0"/>
+        </w:rPr>
+        <w:t xml:space="preserve">6) 완료 판정: 두 과제 완료의 구체적 기준, 판정 절차, 시스템 오류와 후속 수행의 처리 기준을 명시한다. 제한시간 내 완료와 제한시간을 적용하지 않은 최종 완료를 구분한다.</w:t>
+      </w:r>
+    </w:p>
+    <w:p>
+      <w:pPr>
+        <w:spacing w:after="120" w:line="300" w:lineRule="auto"/>
+        <w:rPr/>
+      </w:pPr>
+      <w:r>
+        <w:rPr>
+          <w:rtl w:val="0"/>
+        </w:rPr>
+        <w:t xml:space="preserve">7) 그림 검증: 그림 1의 막대 높이와 오차막대가 표 3의 최신 수치 및 통계량과 일치하는지 그림 생성 자료에서 확인한다. 그림 2의 개별 점과 분포 요약도 표 7 및 정제된 참가자별 로그와 대조한다.</w:t>
       </w:r>
     </w:p>
     <w:sectPr>
@@ -19015,7 +19195,7 @@
       <w:rFonts w:ascii="Noto Sans" w:cs="Noto Sans" w:eastAsia="Noto Sans" w:hAnsi="Noto Sans"/>
       <w:b w:val="1"/>
       <w:bCs w:val="1"/>
-      <w:color w:val="17365d"/>
+      <w:color w:val="000000"/>
       <w:sz w:val="28"/>
       <w:szCs w:val="28"/>
     </w:rPr>
@@ -19033,7 +19213,7 @@
       <w:rFonts w:ascii="Noto Sans" w:cs="Noto Sans" w:eastAsia="Noto Sans" w:hAnsi="Noto Sans"/>
       <w:b w:val="1"/>
       <w:bCs w:val="1"/>
-      <w:color w:val="2f5597"/>
+      <w:color w:val="000000"/>
       <w:sz w:val="23"/>
       <w:szCs w:val="23"/>
     </w:rPr>
@@ -19107,19 +19287,30 @@
     <w:basedOn w:val="Normal"/>
     <w:next w:val="Normal"/>
     <w:pPr>
-      <w:pBdr>
-        <w:bottom w:color="4f81bd" w:space="4" w:sz="8" w:val="single"/>
-      </w:pBdr>
       <w:spacing w:after="300" w:line="240" w:lineRule="auto"/>
     </w:pPr>
     <w:rPr>
       <w:rFonts w:ascii="Noto Sans" w:cs="Noto Sans" w:eastAsia="Noto Sans" w:hAnsi="Noto Sans"/>
       <w:b w:val="1"/>
       <w:bCs w:val="1"/>
-      <w:color w:val="17365d"/>
+      <w:color w:val="000000"/>
       <w:sz w:val="36"/>
       <w:szCs w:val="36"/>
     </w:rPr>
+  </w:style>
+  <w:style w:type="table" w:styleId="TableNormal" w:default="1">
+    <w:name w:val="TableNormal"/>
+    <w:tblPr>
+      <w:tblCellMar>
+        <w:top w:w="100.0" w:type="dxa"/>
+        <w:left w:w="100.0" w:type="dxa"/>
+        <w:bottom w:w="100.0" w:type="dxa"/>
+        <w:right w:w="100.0" w:type="dxa"/>
+      </w:tblCellMar>
+    </w:tblPr>
+  </w:style>
+  <w:style w:type="paragraph" w:styleId="Normal" w:default="1">
+    <w:name w:val="normal"/>
   </w:style>
   <w:style w:type="table" w:styleId="TableNormal" w:default="1">
     <w:name w:val="TableNormal"/>
@@ -30925,6 +31116,123 @@
       </w:tblCellMar>
     </w:tblPr>
   </w:style>
+  <w:style w:type="table" w:styleId="Table1">
+    <w:basedOn w:val="TableNormal"/>
+    <w:tblPr>
+      <w:tblStyleRowBandSize w:val="1"/>
+      <w:tblStyleColBandSize w:val="1"/>
+      <w:tblCellMar>
+        <w:top w:w="0.0" w:type="dxa"/>
+        <w:left w:w="115.0" w:type="dxa"/>
+        <w:bottom w:w="0.0" w:type="dxa"/>
+        <w:right w:w="115.0" w:type="dxa"/>
+      </w:tblCellMar>
+    </w:tblPr>
+  </w:style>
+  <w:style w:type="table" w:styleId="Table2">
+    <w:basedOn w:val="TableNormal"/>
+    <w:tblPr>
+      <w:tblStyleRowBandSize w:val="1"/>
+      <w:tblStyleColBandSize w:val="1"/>
+      <w:tblCellMar>
+        <w:top w:w="0.0" w:type="dxa"/>
+        <w:left w:w="115.0" w:type="dxa"/>
+        <w:bottom w:w="0.0" w:type="dxa"/>
+        <w:right w:w="115.0" w:type="dxa"/>
+      </w:tblCellMar>
+    </w:tblPr>
+  </w:style>
+  <w:style w:type="table" w:styleId="Table3">
+    <w:basedOn w:val="TableNormal"/>
+    <w:tblPr>
+      <w:tblStyleRowBandSize w:val="1"/>
+      <w:tblStyleColBandSize w:val="1"/>
+      <w:tblCellMar>
+        <w:top w:w="0.0" w:type="dxa"/>
+        <w:left w:w="115.0" w:type="dxa"/>
+        <w:bottom w:w="0.0" w:type="dxa"/>
+        <w:right w:w="115.0" w:type="dxa"/>
+      </w:tblCellMar>
+    </w:tblPr>
+  </w:style>
+  <w:style w:type="table" w:styleId="Table4">
+    <w:basedOn w:val="TableNormal"/>
+    <w:tblPr>
+      <w:tblStyleRowBandSize w:val="1"/>
+      <w:tblStyleColBandSize w:val="1"/>
+      <w:tblCellMar>
+        <w:top w:w="0.0" w:type="dxa"/>
+        <w:left w:w="115.0" w:type="dxa"/>
+        <w:bottom w:w="0.0" w:type="dxa"/>
+        <w:right w:w="115.0" w:type="dxa"/>
+      </w:tblCellMar>
+    </w:tblPr>
+  </w:style>
+  <w:style w:type="table" w:styleId="Table5">
+    <w:basedOn w:val="TableNormal"/>
+    <w:tblPr>
+      <w:tblStyleRowBandSize w:val="1"/>
+      <w:tblStyleColBandSize w:val="1"/>
+      <w:tblCellMar>
+        <w:top w:w="0.0" w:type="dxa"/>
+        <w:left w:w="115.0" w:type="dxa"/>
+        <w:bottom w:w="0.0" w:type="dxa"/>
+        <w:right w:w="115.0" w:type="dxa"/>
+      </w:tblCellMar>
+    </w:tblPr>
+  </w:style>
+  <w:style w:type="table" w:styleId="Table6">
+    <w:basedOn w:val="TableNormal"/>
+    <w:tblPr>
+      <w:tblStyleRowBandSize w:val="1"/>
+      <w:tblStyleColBandSize w:val="1"/>
+      <w:tblCellMar>
+        <w:top w:w="0.0" w:type="dxa"/>
+        <w:left w:w="115.0" w:type="dxa"/>
+        <w:bottom w:w="0.0" w:type="dxa"/>
+        <w:right w:w="115.0" w:type="dxa"/>
+      </w:tblCellMar>
+    </w:tblPr>
+  </w:style>
+  <w:style w:type="table" w:styleId="Table7">
+    <w:basedOn w:val="TableNormal"/>
+    <w:tblPr>
+      <w:tblStyleRowBandSize w:val="1"/>
+      <w:tblStyleColBandSize w:val="1"/>
+      <w:tblCellMar>
+        <w:top w:w="0.0" w:type="dxa"/>
+        <w:left w:w="115.0" w:type="dxa"/>
+        <w:bottom w:w="0.0" w:type="dxa"/>
+        <w:right w:w="115.0" w:type="dxa"/>
+      </w:tblCellMar>
+    </w:tblPr>
+  </w:style>
+  <w:style w:type="table" w:styleId="Table8">
+    <w:basedOn w:val="TableNormal"/>
+    <w:tblPr>
+      <w:tblStyleRowBandSize w:val="1"/>
+      <w:tblStyleColBandSize w:val="1"/>
+      <w:tblCellMar>
+        <w:top w:w="0.0" w:type="dxa"/>
+        <w:left w:w="115.0" w:type="dxa"/>
+        <w:bottom w:w="0.0" w:type="dxa"/>
+        <w:right w:w="115.0" w:type="dxa"/>
+      </w:tblCellMar>
+    </w:tblPr>
+  </w:style>
+  <w:style w:type="table" w:styleId="Table9">
+    <w:basedOn w:val="TableNormal"/>
+    <w:tblPr>
+      <w:tblStyleRowBandSize w:val="1"/>
+      <w:tblStyleColBandSize w:val="1"/>
+      <w:tblCellMar>
+        <w:top w:w="0.0" w:type="dxa"/>
+        <w:left w:w="115.0" w:type="dxa"/>
+        <w:bottom w:w="0.0" w:type="dxa"/>
+        <w:right w:w="115.0" w:type="dxa"/>
+      </w:tblCellMar>
+    </w:tblPr>
+  </w:style>
   <w:style w:type="paragraph" w:styleId="Subtitle">
     <w:name w:val="Subtitle"/>
     <w:basedOn w:val="Normal"/>
@@ -31381,7 +31689,7 @@
 
 <file path=customXML/item1.xml><?xml version="1.0" encoding="utf-8"?>
 <go:gDocsCustomXmlDataStorage xmlns:go="http://customooxmlschemas.google.com/" xmlns:r="http://schemas.openxmlformats.org/officeDocument/2006/relationships" uri="GoogleDocsCustomDataVersion2">
-  <go:docsCustomData xmlns:go="http://customooxmlschemas.google.com/" roundtripDataSignature="AMtx7mglBdm+jWsbHnmxRBeZ1IoPQbLjJA==">CgMxLjAaJQoBMBIgCh4IB0IaCg9UaW1lcyBOZXcgUm9tYW4SB0d1bmdzdWgaJQoBMRIgCh4IB0IaCg9UaW1lcyBOZXcgUm9tYW4SB0d1bmdzdWgaJQoBMhIgCh4IB0IaCg9UaW1lcyBOZXcgUm9tYW4SB0d1bmdzdWgaJQoBMxIgCh4IB0IaCg9UaW1lcyBOZXcgUm9tYW4SB0d1bmdzdWgaJQoBNBIgCh4IB0IaCg9UaW1lcyBOZXcgUm9tYW4SB0d1bmdzdWg4AHIhMTk3NFd4QXAwTGF6UGg5ZGRBUnVQcWg2d2RLOVZyeF9i</go:docsCustomData>
+  <go:docsCustomData xmlns:go="http://customooxmlschemas.google.com/" roundtripDataSignature="AMtx7mje7j5v1o72lxkIdQpRDe1d5dn2uQ==">CgMxLjAaJQoBMBIgCh4IB0IaCg9UaW1lcyBOZXcgUm9tYW4SB0d1bmdzdWgaJQoBMRIgCh4IB0IaCg9UaW1lcyBOZXcgUm9tYW4SB0d1bmdzdWgaJQoBMhIgCh4IB0IaCg9UaW1lcyBOZXcgUm9tYW4SB0d1bmdzdWgaJQoBMxIgCh4IB0IaCg9UaW1lcyBOZXcgUm9tYW4SB0d1bmdzdWg4AHIhMTk3NFd4QXAwTGF6UGg5ZGRBUnVQcWg2d2RLOVZyeF9i</go:docsCustomData>
 </go:gDocsCustomXmlDataStorage>
 </file>
 

</xml_diff>